<commit_message>
Restyle class-meeting plan with original detective-file design
Replace the first design, which followed the reference sample too closely
(yellow frame with white card, pastel rounded tags, ribbon banners with a
character head, NEWS badge, speech bubble). New look built from the
document's own detective theme: graph-paper notebook page with binder
strip, file-tab section labels with pushpins, kraft case-folder stage
banners with ink stamps, an evidence-board process overview joined by a
red thread, newspaper-clipping news boxes and a navy code card for the
chants. Text still identical to the source (verify.py).

Co-Authored-By: Claude Opus 5.5 <noreply@anthropic.com>
Claude-Session: https://claude.ai/code/session_0172ga6Pq1pjSb9Cqb6GGu5J
</commit_message>
<xml_diff>
--- a/banhui-meihua/队伍侦探社_班会设计_美化版.docx
+++ b/banhui-meihua/队伍侦探社_班会设计_美化版.docx
@@ -11,7 +11,7 @@
       <w:r>
         <w:drawing>
           <wp:inline distT="0" distB="0" distL="0" distR="0">
-            <wp:extent cx="5905500" cy="2495550"/>
+            <wp:extent cx="5905500" cy="2438400"/>
             <wp:effectExtent t="0" r="0" b="0" l="0"/>
             <wp:docPr id="101" name="队伍侦探社  寻回“最美一条线” ——二年级行为习惯主题班会" descr="队伍侦探社  寻回“最美一条线” ——二年级行为习惯主题班会" title="队伍侦探社  寻回“最美一条线” ——二年级行为习惯主题班会"/>
             <wp:cNvGraphicFramePr>
@@ -36,7 +36,7 @@
                   <pic:spPr bwMode="auto">
                     <a:xfrm>
                       <a:off x="0" y="0"/>
-                      <a:ext cx="5905500" cy="2495550"/>
+                      <a:ext cx="5905500" cy="2438400"/>
                     </a:xfrm>
                     <a:prstGeom prst="rect">
                       <a:avLst/>
@@ -52,13 +52,13 @@
     <w:p>
       <w:pPr>
         <w:keepNext/>
-        <w:spacing w:after="100" w:before="220" w:line="240" w:lineRule="auto"/>
+        <w:spacing w:after="120" w:before="240" w:line="240" w:lineRule="auto"/>
         <w:jc w:val="left"/>
       </w:pPr>
       <w:r>
         <w:drawing>
           <wp:inline distT="0" distB="0" distL="0" distR="0">
-            <wp:extent cx="1409700" cy="361950"/>
+            <wp:extent cx="5905500" cy="342900"/>
             <wp:effectExtent t="0" r="0" b="0" l="0"/>
             <wp:docPr id="102" name="【背景分析】" descr="【背景分析】" title="【背景分析】"/>
             <wp:cNvGraphicFramePr>
@@ -83,7 +83,7 @@
                   <pic:spPr bwMode="auto">
                     <a:xfrm>
                       <a:off x="0" y="0"/>
-                      <a:ext cx="1409700" cy="361950"/>
+                      <a:ext cx="5905500" cy="342900"/>
                     </a:xfrm>
                     <a:prstGeom prst="rect">
                       <a:avLst/>
@@ -100,7 +100,7 @@
       <w:pPr>
         <w:keepNext/>
         <w:pBdr>
-          <w:left w:val="single" w:color="FFCC39" w:sz="36" w:space="6"/>
+          <w:left w:val="single" w:color="F2B705" w:sz="36" w:space="6"/>
         </w:pBdr>
         <w:spacing w:after="80" w:before="160" w:line="300" w:lineRule="auto"/>
         <w:ind w:left="120"/>
@@ -110,7 +110,7 @@
           <w:rFonts w:ascii="微软雅黑" w:cs="微软雅黑" w:eastAsia="微软雅黑" w:hAnsi="微软雅黑"/>
           <w:b/>
           <w:bCs/>
-          <w:color w:val="D9700F"/>
+          <w:color w:val="C8423B"/>
           <w:sz w:val="26"/>
           <w:szCs w:val="26"/>
         </w:rPr>
@@ -121,7 +121,7 @@
           <w:rFonts w:ascii="微软雅黑" w:cs="微软雅黑" w:eastAsia="微软雅黑" w:hAnsi="微软雅黑"/>
           <w:b/>
           <w:bCs/>
-          <w:color w:val="12346E"/>
+          <w:color w:val="1E3460"/>
           <w:sz w:val="26"/>
           <w:szCs w:val="26"/>
         </w:rPr>
@@ -152,7 +152,7 @@
           <w:rFonts w:ascii="Times New Roman" w:cs="Times New Roman" w:eastAsia="宋体" w:hAnsi="Times New Roman"/>
           <w:b/>
           <w:bCs/>
-          <w:color w:val="0B4B9B"/>
+          <w:color w:val="1E3460"/>
           <w:sz w:val="24"/>
           <w:szCs w:val="24"/>
         </w:rPr>
@@ -174,7 +174,7 @@
           <w:rFonts w:ascii="Times New Roman" w:cs="Times New Roman" w:eastAsia="宋体" w:hAnsi="Times New Roman"/>
           <w:b/>
           <w:bCs/>
-          <w:color w:val="0B4B9B"/>
+          <w:color w:val="1E3460"/>
           <w:sz w:val="24"/>
           <w:szCs w:val="24"/>
         </w:rPr>
@@ -196,7 +196,7 @@
       <w:pPr>
         <w:keepNext/>
         <w:pBdr>
-          <w:left w:val="single" w:color="FFCC39" w:sz="36" w:space="6"/>
+          <w:left w:val="single" w:color="F2B705" w:sz="36" w:space="6"/>
         </w:pBdr>
         <w:spacing w:after="80" w:before="160" w:line="300" w:lineRule="auto"/>
         <w:ind w:left="120"/>
@@ -206,7 +206,7 @@
           <w:rFonts w:ascii="微软雅黑" w:cs="微软雅黑" w:eastAsia="微软雅黑" w:hAnsi="微软雅黑"/>
           <w:b/>
           <w:bCs/>
-          <w:color w:val="D9700F"/>
+          <w:color w:val="C8423B"/>
           <w:sz w:val="26"/>
           <w:szCs w:val="26"/>
         </w:rPr>
@@ -217,7 +217,7 @@
           <w:rFonts w:ascii="微软雅黑" w:cs="微软雅黑" w:eastAsia="微软雅黑" w:hAnsi="微软雅黑"/>
           <w:b/>
           <w:bCs/>
-          <w:color w:val="12346E"/>
+          <w:color w:val="1E3460"/>
           <w:sz w:val="26"/>
           <w:szCs w:val="26"/>
         </w:rPr>
@@ -247,13 +247,13 @@
     <w:p>
       <w:pPr>
         <w:keepNext/>
-        <w:spacing w:after="100" w:before="220" w:line="240" w:lineRule="auto"/>
+        <w:spacing w:after="120" w:before="240" w:line="240" w:lineRule="auto"/>
         <w:jc w:val="left"/>
       </w:pPr>
       <w:r>
         <w:drawing>
           <wp:inline distT="0" distB="0" distL="0" distR="0">
-            <wp:extent cx="1409700" cy="361950"/>
+            <wp:extent cx="5905500" cy="342900"/>
             <wp:effectExtent t="0" r="0" b="0" l="0"/>
             <wp:docPr id="103" name="【班会目标】" descr="【班会目标】" title="【班会目标】"/>
             <wp:cNvGraphicFramePr>
@@ -278,7 +278,7 @@
                   <pic:spPr bwMode="auto">
                     <a:xfrm>
                       <a:off x="0" y="0"/>
-                      <a:ext cx="1409700" cy="361950"/>
+                      <a:ext cx="5905500" cy="342900"/>
                     </a:xfrm>
                     <a:prstGeom prst="rect">
                       <a:avLst/>
@@ -304,7 +304,7 @@
           <w:rFonts w:ascii="微软雅黑" w:cs="微软雅黑" w:eastAsia="微软雅黑" w:hAnsi="微软雅黑"/>
           <w:b/>
           <w:bCs/>
-          <w:color w:val="D9700F"/>
+          <w:color w:val="C8423B"/>
           <w:sz w:val="24"/>
           <w:szCs w:val="24"/>
         </w:rPr>
@@ -315,7 +315,7 @@
           <w:rFonts w:ascii="Times New Roman" w:cs="Times New Roman" w:eastAsia="宋体" w:hAnsi="Times New Roman"/>
           <w:b/>
           <w:bCs/>
-          <w:color w:val="0B4B9B"/>
+          <w:color w:val="1E3460"/>
           <w:sz w:val="24"/>
           <w:szCs w:val="24"/>
         </w:rPr>
@@ -346,7 +346,7 @@
           <w:rFonts w:ascii="微软雅黑" w:cs="微软雅黑" w:eastAsia="微软雅黑" w:hAnsi="微软雅黑"/>
           <w:b/>
           <w:bCs/>
-          <w:color w:val="D9700F"/>
+          <w:color w:val="C8423B"/>
           <w:sz w:val="24"/>
           <w:szCs w:val="24"/>
         </w:rPr>
@@ -357,7 +357,7 @@
           <w:rFonts w:ascii="Times New Roman" w:cs="Times New Roman" w:eastAsia="宋体" w:hAnsi="Times New Roman"/>
           <w:b/>
           <w:bCs/>
-          <w:color w:val="0B4B9B"/>
+          <w:color w:val="1E3460"/>
           <w:sz w:val="24"/>
           <w:szCs w:val="24"/>
         </w:rPr>
@@ -388,7 +388,7 @@
           <w:rFonts w:ascii="微软雅黑" w:cs="微软雅黑" w:eastAsia="微软雅黑" w:hAnsi="微软雅黑"/>
           <w:b/>
           <w:bCs/>
-          <w:color w:val="D9700F"/>
+          <w:color w:val="C8423B"/>
           <w:sz w:val="24"/>
           <w:szCs w:val="24"/>
         </w:rPr>
@@ -399,7 +399,7 @@
           <w:rFonts w:ascii="Times New Roman" w:cs="Times New Roman" w:eastAsia="宋体" w:hAnsi="Times New Roman"/>
           <w:b/>
           <w:bCs/>
-          <w:color w:val="0B4B9B"/>
+          <w:color w:val="1E3460"/>
           <w:sz w:val="24"/>
           <w:szCs w:val="24"/>
         </w:rPr>
@@ -420,13 +420,13 @@
     <w:p>
       <w:pPr>
         <w:keepNext/>
-        <w:spacing w:after="100" w:before="220" w:line="240" w:lineRule="auto"/>
+        <w:spacing w:after="120" w:before="240" w:line="240" w:lineRule="auto"/>
         <w:jc w:val="left"/>
       </w:pPr>
       <w:r>
         <w:drawing>
           <wp:inline distT="0" distB="0" distL="0" distR="0">
-            <wp:extent cx="1409700" cy="361950"/>
+            <wp:extent cx="5905500" cy="342900"/>
             <wp:effectExtent t="0" r="0" b="0" l="0"/>
             <wp:docPr id="104" name="【班会准备】" descr="【班会准备】" title="【班会准备】"/>
             <wp:cNvGraphicFramePr>
@@ -451,7 +451,7 @@
                   <pic:spPr bwMode="auto">
                     <a:xfrm>
                       <a:off x="0" y="0"/>
-                      <a:ext cx="1409700" cy="361950"/>
+                      <a:ext cx="5905500" cy="342900"/>
                     </a:xfrm>
                     <a:prstGeom prst="rect">
                       <a:avLst/>
@@ -477,7 +477,7 @@
           <w:rFonts w:ascii="Times New Roman" w:cs="Times New Roman" w:eastAsia="宋体" w:hAnsi="Times New Roman"/>
           <w:b/>
           <w:bCs/>
-          <w:color w:val="0B4B9B"/>
+          <w:color w:val="1E3460"/>
           <w:sz w:val="24"/>
           <w:szCs w:val="24"/>
         </w:rPr>
@@ -508,7 +508,7 @@
           <w:rFonts w:ascii="Times New Roman" w:cs="Times New Roman" w:eastAsia="宋体" w:hAnsi="Times New Roman"/>
           <w:b/>
           <w:bCs/>
-          <w:color w:val="0B4B9B"/>
+          <w:color w:val="1E3460"/>
           <w:sz w:val="24"/>
           <w:szCs w:val="24"/>
         </w:rPr>
@@ -576,13 +576,13 @@
     <w:p>
       <w:pPr>
         <w:keepNext/>
-        <w:spacing w:after="100" w:before="220" w:line="240" w:lineRule="auto"/>
+        <w:spacing w:after="120" w:before="240" w:line="240" w:lineRule="auto"/>
         <w:jc w:val="left"/>
       </w:pPr>
       <w:r>
         <w:drawing>
           <wp:inline distT="0" distB="0" distL="0" distR="0">
-            <wp:extent cx="1409700" cy="361950"/>
+            <wp:extent cx="5905500" cy="342900"/>
             <wp:effectExtent t="0" r="0" b="0" l="0"/>
             <wp:docPr id="106" name="【班会过程】" descr="【班会过程】" title="【班会过程】"/>
             <wp:cNvGraphicFramePr>
@@ -607,7 +607,7 @@
                   <pic:spPr bwMode="auto">
                     <a:xfrm>
                       <a:off x="0" y="0"/>
-                      <a:ext cx="1409700" cy="361950"/>
+                      <a:ext cx="5905500" cy="342900"/>
                     </a:xfrm>
                     <a:prstGeom prst="rect">
                       <a:avLst/>
@@ -629,7 +629,7 @@
       <w:r>
         <w:drawing>
           <wp:inline distT="0" distB="0" distL="0" distR="0">
-            <wp:extent cx="5905500" cy="3381375"/>
+            <wp:extent cx="5905500" cy="3600450"/>
             <wp:effectExtent t="0" r="0" b="0" l="0"/>
             <wp:docPr id="107" name="班会过程总览：导入 侦探集结令——初识队伍一条线；知 情 意 行 四个环节" descr="班会过程总览：导入 侦探集结令——初识队伍一条线；知 情 意 行 四个环节" title="班会过程总览：导入 侦探集结令——初识队伍一条线；知 情 意 行 四个环节"/>
             <wp:cNvGraphicFramePr>
@@ -654,7 +654,7 @@
                   <pic:spPr bwMode="auto">
                     <a:xfrm>
                       <a:off x="0" y="0"/>
-                      <a:ext cx="5905500" cy="3381375"/>
+                      <a:ext cx="5905500" cy="3600450"/>
                     </a:xfrm>
                     <a:prstGeom prst="rect">
                       <a:avLst/>
@@ -670,13 +670,13 @@
     <w:p>
       <w:pPr>
         <w:keepNext/>
-        <w:spacing w:after="160" w:before="320" w:line="240" w:lineRule="auto"/>
+        <w:spacing w:after="140" w:before="300" w:line="240" w:lineRule="auto"/>
         <w:jc w:val="center"/>
       </w:pPr>
       <w:r>
         <w:drawing>
           <wp:inline distT="0" distB="0" distL="0" distR="0">
-            <wp:extent cx="5581650" cy="723900"/>
+            <wp:extent cx="5553075" cy="857250"/>
             <wp:effectExtent t="0" r="0" b="0" l="0"/>
             <wp:docPr id="108" name="导入：侦探集结令——初识队伍一条线" descr="导入：侦探集结令——初识队伍一条线" title="导入：侦探集结令——初识队伍一条线"/>
             <wp:cNvGraphicFramePr>
@@ -701,7 +701,7 @@
                   <pic:spPr bwMode="auto">
                     <a:xfrm>
                       <a:off x="0" y="0"/>
-                      <a:ext cx="5581650" cy="723900"/>
+                      <a:ext cx="5553075" cy="857250"/>
                     </a:xfrm>
                     <a:prstGeom prst="rect">
                       <a:avLst/>
@@ -767,7 +767,7 @@
           <w:rFonts w:ascii="微软雅黑" w:cs="微软雅黑" w:eastAsia="微软雅黑" w:hAnsi="微软雅黑"/>
           <w:b/>
           <w:bCs/>
-          <w:color w:val="0B4B9B"/>
+          <w:color w:val="1E3460"/>
           <w:sz w:val="24"/>
           <w:szCs w:val="24"/>
         </w:rPr>
@@ -788,14 +788,14 @@
     <w:p>
       <w:pPr>
         <w:pBdr>
-          <w:top w:val="dashed" w:color="F5B041" w:sz="8" w:space="6"/>
-          <w:left w:val="dashed" w:color="F5B041" w:sz="8" w:space="6"/>
-          <w:bottom w:val="dashed" w:color="F5B041" w:sz="8" w:space="6"/>
-          <w:right w:val="dashed" w:color="F5B041" w:sz="8" w:space="6"/>
+          <w:top w:val="single" w:color="FFF6D5" w:sz="4" w:space="5"/>
+          <w:left w:val="single" w:color="F2B705" w:sz="36" w:space="10"/>
+          <w:bottom w:val="single" w:color="FFF6D5" w:sz="4" w:space="5"/>
+          <w:right w:val="single" w:color="FFF6D5" w:sz="4" w:space="5"/>
         </w:pBdr>
-        <w:shd w:fill="FFF7E1" w:color="auto" w:val="clear"/>
+        <w:shd w:fill="FFF6D5" w:color="auto" w:val="clear"/>
         <w:spacing w:after="160" w:before="200" w:line="440" w:lineRule="exact"/>
-        <w:ind w:left="140" w:right="140"/>
+        <w:ind w:left="200" w:right="120"/>
         <w:jc w:val="both"/>
       </w:pPr>
       <w:r>
@@ -803,7 +803,7 @@
           <w:rFonts w:ascii="Times New Roman" w:cs="Times New Roman" w:eastAsia="楷体" w:hAnsi="Times New Roman"/>
           <w:b/>
           <w:bCs/>
-          <w:color w:val="D9700F"/>
+          <w:color w:val="C8423B"/>
           <w:sz w:val="24"/>
           <w:szCs w:val="24"/>
         </w:rPr>
@@ -814,7 +814,7 @@
           <w:rFonts w:ascii="Times New Roman" w:cs="Times New Roman" w:eastAsia="楷体" w:hAnsi="Times New Roman"/>
           <w:b w:val="false"/>
           <w:bCs w:val="false"/>
-          <w:color w:val="4A3B2A"/>
+          <w:color w:val="3D3D3D"/>
           <w:sz w:val="24"/>
           <w:szCs w:val="24"/>
         </w:rPr>
@@ -824,13 +824,13 @@
     <w:p>
       <w:pPr>
         <w:keepNext/>
-        <w:spacing w:after="160" w:before="320" w:line="240" w:lineRule="auto"/>
+        <w:spacing w:after="140" w:before="300" w:line="240" w:lineRule="auto"/>
         <w:jc w:val="center"/>
       </w:pPr>
       <w:r>
         <w:drawing>
           <wp:inline distT="0" distB="0" distL="0" distR="0">
-            <wp:extent cx="5581650" cy="723900"/>
+            <wp:extent cx="5553075" cy="857250"/>
             <wp:effectExtent t="0" r="0" b="0" l="0"/>
             <wp:docPr id="109" name="环节一  循线索·辨队列之乱" descr="环节一  循线索·辨队列之乱" title="环节一  循线索·辨队列之乱"/>
             <wp:cNvGraphicFramePr>
@@ -855,7 +855,7 @@
                   <pic:spPr bwMode="auto">
                     <a:xfrm>
                       <a:off x="0" y="0"/>
-                      <a:ext cx="5581650" cy="723900"/>
+                      <a:ext cx="5553075" cy="857250"/>
                     </a:xfrm>
                     <a:prstGeom prst="rect">
                       <a:avLst/>
@@ -872,14 +872,14 @@
       <w:pPr>
         <w:keepNext/>
         <w:pBdr>
-          <w:bottom w:val="dotted" w:color="FFCC39" w:sz="12" w:space="3"/>
+          <w:bottom w:val="single" w:color="C9D3E3" w:sz="6" w:space="3"/>
         </w:pBdr>
         <w:spacing w:after="100" w:before="220" w:line="300" w:lineRule="auto"/>
       </w:pPr>
       <w:r>
         <w:drawing>
           <wp:inline distT="0" distB="0" distL="0" distR="0">
-            <wp:extent cx="209550" cy="209550"/>
+            <wp:extent cx="190500" cy="190500"/>
             <wp:effectExtent t="0" r="0" b="0" l="0"/>
             <wp:docPr id="110" name="活动" descr="活动" title="活动"/>
             <wp:cNvGraphicFramePr>
@@ -904,7 +904,7 @@
                   <pic:spPr bwMode="auto">
                     <a:xfrm>
                       <a:off x="0" y="0"/>
-                      <a:ext cx="209550" cy="209550"/>
+                      <a:ext cx="190500" cy="190500"/>
                     </a:xfrm>
                     <a:prstGeom prst="rect">
                       <a:avLst/>
@@ -921,7 +921,7 @@
           <w:rFonts w:ascii="微软雅黑" w:cs="微软雅黑" w:eastAsia="微软雅黑" w:hAnsi="微软雅黑"/>
           <w:b/>
           <w:bCs/>
-          <w:color w:val="3D8BE0"/>
+          <w:color w:val="2F6FD0"/>
           <w:sz w:val="26"/>
           <w:szCs w:val="26"/>
         </w:rPr>
@@ -932,7 +932,7 @@
           <w:rFonts w:ascii="微软雅黑" w:cs="微软雅黑" w:eastAsia="微软雅黑" w:hAnsi="微软雅黑"/>
           <w:b/>
           <w:bCs/>
-          <w:color w:val="12346E"/>
+          <w:color w:val="1E3460"/>
           <w:sz w:val="26"/>
           <w:szCs w:val="26"/>
         </w:rPr>
@@ -963,14 +963,14 @@
       <w:pPr>
         <w:keepNext/>
         <w:pBdr>
-          <w:bottom w:val="dotted" w:color="FFCC39" w:sz="12" w:space="3"/>
+          <w:bottom w:val="single" w:color="C9D3E3" w:sz="6" w:space="3"/>
         </w:pBdr>
         <w:spacing w:after="100" w:before="220" w:line="300" w:lineRule="auto"/>
       </w:pPr>
       <w:r>
         <w:drawing>
           <wp:inline distT="0" distB="0" distL="0" distR="0">
-            <wp:extent cx="209550" cy="209550"/>
+            <wp:extent cx="190500" cy="190500"/>
             <wp:effectExtent t="0" r="0" b="0" l="0"/>
             <wp:docPr id="111" name="活动" descr="活动" title="活动"/>
             <wp:cNvGraphicFramePr>
@@ -995,7 +995,7 @@
                   <pic:spPr bwMode="auto">
                     <a:xfrm>
                       <a:off x="0" y="0"/>
-                      <a:ext cx="209550" cy="209550"/>
+                      <a:ext cx="190500" cy="190500"/>
                     </a:xfrm>
                     <a:prstGeom prst="rect">
                       <a:avLst/>
@@ -1012,7 +1012,7 @@
           <w:rFonts w:ascii="微软雅黑" w:cs="微软雅黑" w:eastAsia="微软雅黑" w:hAnsi="微软雅黑"/>
           <w:b/>
           <w:bCs/>
-          <w:color w:val="3D8BE0"/>
+          <w:color w:val="2F6FD0"/>
           <w:sz w:val="26"/>
           <w:szCs w:val="26"/>
         </w:rPr>
@@ -1023,7 +1023,7 @@
           <w:rFonts w:ascii="微软雅黑" w:cs="微软雅黑" w:eastAsia="微软雅黑" w:hAnsi="微软雅黑"/>
           <w:b/>
           <w:bCs/>
-          <w:color w:val="12346E"/>
+          <w:color w:val="1E3460"/>
           <w:sz w:val="26"/>
           <w:szCs w:val="26"/>
         </w:rPr>
@@ -1063,7 +1063,7 @@
           <w:rFonts w:ascii="微软雅黑" w:cs="微软雅黑" w:eastAsia="微软雅黑" w:hAnsi="微软雅黑"/>
           <w:b/>
           <w:bCs/>
-          <w:color w:val="0B4B9B"/>
+          <w:color w:val="1E3460"/>
           <w:sz w:val="24"/>
           <w:szCs w:val="24"/>
         </w:rPr>
@@ -1084,14 +1084,14 @@
     <w:p>
       <w:pPr>
         <w:pBdr>
-          <w:top w:val="dashed" w:color="F5B041" w:sz="8" w:space="6"/>
-          <w:left w:val="dashed" w:color="F5B041" w:sz="8" w:space="6"/>
-          <w:bottom w:val="dashed" w:color="F5B041" w:sz="8" w:space="6"/>
-          <w:right w:val="dashed" w:color="F5B041" w:sz="8" w:space="6"/>
+          <w:top w:val="single" w:color="FFF6D5" w:sz="4" w:space="5"/>
+          <w:left w:val="single" w:color="F2B705" w:sz="36" w:space="10"/>
+          <w:bottom w:val="single" w:color="FFF6D5" w:sz="4" w:space="5"/>
+          <w:right w:val="single" w:color="FFF6D5" w:sz="4" w:space="5"/>
         </w:pBdr>
-        <w:shd w:fill="FFF7E1" w:color="auto" w:val="clear"/>
+        <w:shd w:fill="FFF6D5" w:color="auto" w:val="clear"/>
         <w:spacing w:after="160" w:before="200" w:line="440" w:lineRule="exact"/>
-        <w:ind w:left="140" w:right="140"/>
+        <w:ind w:left="200" w:right="120"/>
         <w:jc w:val="both"/>
       </w:pPr>
       <w:r>
@@ -1099,7 +1099,7 @@
           <w:rFonts w:ascii="Times New Roman" w:cs="Times New Roman" w:eastAsia="楷体" w:hAnsi="Times New Roman"/>
           <w:b/>
           <w:bCs/>
-          <w:color w:val="D9700F"/>
+          <w:color w:val="C8423B"/>
           <w:sz w:val="24"/>
           <w:szCs w:val="24"/>
         </w:rPr>
@@ -1110,7 +1110,7 @@
           <w:rFonts w:ascii="Times New Roman" w:cs="Times New Roman" w:eastAsia="楷体" w:hAnsi="Times New Roman"/>
           <w:b w:val="false"/>
           <w:bCs w:val="false"/>
-          <w:color w:val="4A3B2A"/>
+          <w:color w:val="3D3D3D"/>
           <w:sz w:val="24"/>
           <w:szCs w:val="24"/>
         </w:rPr>
@@ -1120,13 +1120,13 @@
     <w:p>
       <w:pPr>
         <w:keepNext/>
-        <w:spacing w:after="160" w:before="320" w:line="240" w:lineRule="auto"/>
+        <w:spacing w:after="140" w:before="300" w:line="240" w:lineRule="auto"/>
         <w:jc w:val="center"/>
       </w:pPr>
       <w:r>
         <w:drawing>
           <wp:inline distT="0" distB="0" distL="0" distR="0">
-            <wp:extent cx="5581650" cy="723900"/>
+            <wp:extent cx="5553075" cy="857250"/>
             <wp:effectExtent t="0" r="0" b="0" l="0"/>
             <wp:docPr id="112" name="环节二  探现场·察隐患之危" descr="环节二  探现场·察隐患之危" title="环节二  探现场·察隐患之危"/>
             <wp:cNvGraphicFramePr>
@@ -1151,7 +1151,7 @@
                   <pic:spPr bwMode="auto">
                     <a:xfrm>
                       <a:off x="0" y="0"/>
-                      <a:ext cx="5581650" cy="723900"/>
+                      <a:ext cx="5553075" cy="857250"/>
                     </a:xfrm>
                     <a:prstGeom prst="rect">
                       <a:avLst/>
@@ -1168,14 +1168,14 @@
       <w:pPr>
         <w:keepNext/>
         <w:pBdr>
-          <w:bottom w:val="dotted" w:color="FFCC39" w:sz="12" w:space="3"/>
+          <w:bottom w:val="single" w:color="C9D3E3" w:sz="6" w:space="3"/>
         </w:pBdr>
         <w:spacing w:after="100" w:before="220" w:line="300" w:lineRule="auto"/>
       </w:pPr>
       <w:r>
         <w:drawing>
           <wp:inline distT="0" distB="0" distL="0" distR="0">
-            <wp:extent cx="209550" cy="209550"/>
+            <wp:extent cx="190500" cy="190500"/>
             <wp:effectExtent t="0" r="0" b="0" l="0"/>
             <wp:docPr id="113" name="活动" descr="活动" title="活动"/>
             <wp:cNvGraphicFramePr>
@@ -1200,7 +1200,7 @@
                   <pic:spPr bwMode="auto">
                     <a:xfrm>
                       <a:off x="0" y="0"/>
-                      <a:ext cx="209550" cy="209550"/>
+                      <a:ext cx="190500" cy="190500"/>
                     </a:xfrm>
                     <a:prstGeom prst="rect">
                       <a:avLst/>
@@ -1217,7 +1217,7 @@
           <w:rFonts w:ascii="微软雅黑" w:cs="微软雅黑" w:eastAsia="微软雅黑" w:hAnsi="微软雅黑"/>
           <w:b/>
           <w:bCs/>
-          <w:color w:val="F2994A"/>
+          <w:color w:val="D9534F"/>
           <w:sz w:val="26"/>
           <w:szCs w:val="26"/>
         </w:rPr>
@@ -1228,7 +1228,7 @@
           <w:rFonts w:ascii="微软雅黑" w:cs="微软雅黑" w:eastAsia="微软雅黑" w:hAnsi="微软雅黑"/>
           <w:b/>
           <w:bCs/>
-          <w:color w:val="12346E"/>
+          <w:color w:val="1E3460"/>
           <w:sz w:val="26"/>
           <w:szCs w:val="26"/>
         </w:rPr>
@@ -1248,7 +1248,7 @@
           <w:rFonts w:ascii="微软雅黑" w:cs="微软雅黑" w:eastAsia="微软雅黑" w:hAnsi="微软雅黑"/>
           <w:b/>
           <w:bCs/>
-          <w:color w:val="D9700F"/>
+          <w:color w:val="C8423B"/>
           <w:sz w:val="24"/>
           <w:szCs w:val="24"/>
         </w:rPr>
@@ -1259,7 +1259,7 @@
           <w:rFonts w:ascii="Times New Roman" w:cs="Times New Roman" w:eastAsia="宋体" w:hAnsi="Times New Roman"/>
           <w:b/>
           <w:bCs/>
-          <w:color w:val="0B4B9B"/>
+          <w:color w:val="1E3460"/>
           <w:sz w:val="24"/>
           <w:szCs w:val="24"/>
         </w:rPr>
@@ -1306,12 +1306,12 @@
           <w:tcPr>
             <w:tcW w:type="dxa" w:w="2500"/>
             <w:tcBorders>
-              <w:top w:val="single" w:color="BCD3F0" w:sz="6"/>
-              <w:left w:val="single" w:color="BCD3F0" w:sz="6"/>
-              <w:bottom w:val="single" w:color="BCD3F0" w:sz="6"/>
-              <w:right w:val="single" w:color="BCD3F0" w:sz="6"/>
+              <w:top w:val="single" w:color="C3CEDF" w:sz="6"/>
+              <w:left w:val="single" w:color="C3CEDF" w:sz="6"/>
+              <w:bottom w:val="single" w:color="C3CEDF" w:sz="6"/>
+              <w:right w:val="single" w:color="C3CEDF" w:sz="6"/>
             </w:tcBorders>
-            <w:shd w:fill="0B4B9B" w:color="auto" w:val="clear"/>
+            <w:shd w:fill="1E3460" w:color="auto" w:val="clear"/>
             <w:tcMar>
               <w:top w:type="dxa" w:w="90"/>
               <w:left w:type="dxa" w:w="120"/>
@@ -1342,12 +1342,12 @@
           <w:tcPr>
             <w:tcW w:type="dxa" w:w="2200"/>
             <w:tcBorders>
-              <w:top w:val="single" w:color="BCD3F0" w:sz="6"/>
-              <w:left w:val="single" w:color="BCD3F0" w:sz="6"/>
-              <w:bottom w:val="single" w:color="BCD3F0" w:sz="6"/>
-              <w:right w:val="single" w:color="BCD3F0" w:sz="6"/>
+              <w:top w:val="single" w:color="C3CEDF" w:sz="6"/>
+              <w:left w:val="single" w:color="C3CEDF" w:sz="6"/>
+              <w:bottom w:val="single" w:color="C3CEDF" w:sz="6"/>
+              <w:right w:val="single" w:color="C3CEDF" w:sz="6"/>
             </w:tcBorders>
-            <w:shd w:fill="0B4B9B" w:color="auto" w:val="clear"/>
+            <w:shd w:fill="1E3460" w:color="auto" w:val="clear"/>
             <w:tcMar>
               <w:top w:type="dxa" w:w="90"/>
               <w:left w:type="dxa" w:w="120"/>
@@ -1378,12 +1378,12 @@
           <w:tcPr>
             <w:tcW w:type="dxa" w:w="2200"/>
             <w:tcBorders>
-              <w:top w:val="single" w:color="BCD3F0" w:sz="6"/>
-              <w:left w:val="single" w:color="BCD3F0" w:sz="6"/>
-              <w:bottom w:val="single" w:color="BCD3F0" w:sz="6"/>
-              <w:right w:val="single" w:color="BCD3F0" w:sz="6"/>
+              <w:top w:val="single" w:color="C3CEDF" w:sz="6"/>
+              <w:left w:val="single" w:color="C3CEDF" w:sz="6"/>
+              <w:bottom w:val="single" w:color="C3CEDF" w:sz="6"/>
+              <w:right w:val="single" w:color="C3CEDF" w:sz="6"/>
             </w:tcBorders>
-            <w:shd w:fill="0B4B9B" w:color="auto" w:val="clear"/>
+            <w:shd w:fill="1E3460" w:color="auto" w:val="clear"/>
             <w:tcMar>
               <w:top w:type="dxa" w:w="90"/>
               <w:left w:type="dxa" w:w="120"/>
@@ -1414,12 +1414,12 @@
           <w:tcPr>
             <w:tcW w:type="dxa" w:w="2398"/>
             <w:tcBorders>
-              <w:top w:val="single" w:color="BCD3F0" w:sz="6"/>
-              <w:left w:val="single" w:color="BCD3F0" w:sz="6"/>
-              <w:bottom w:val="single" w:color="BCD3F0" w:sz="6"/>
-              <w:right w:val="single" w:color="BCD3F0" w:sz="6"/>
+              <w:top w:val="single" w:color="C3CEDF" w:sz="6"/>
+              <w:left w:val="single" w:color="C3CEDF" w:sz="6"/>
+              <w:bottom w:val="single" w:color="C3CEDF" w:sz="6"/>
+              <w:right w:val="single" w:color="C3CEDF" w:sz="6"/>
             </w:tcBorders>
-            <w:shd w:fill="0B4B9B" w:color="auto" w:val="clear"/>
+            <w:shd w:fill="1E3460" w:color="auto" w:val="clear"/>
             <w:tcMar>
               <w:top w:type="dxa" w:w="90"/>
               <w:left w:type="dxa" w:w="120"/>
@@ -1455,12 +1455,12 @@
           <w:tcPr>
             <w:tcW w:type="dxa" w:w="2500"/>
             <w:tcBorders>
-              <w:top w:val="single" w:color="BCD3F0" w:sz="6"/>
-              <w:left w:val="single" w:color="BCD3F0" w:sz="6"/>
-              <w:bottom w:val="single" w:color="BCD3F0" w:sz="6"/>
-              <w:right w:val="single" w:color="BCD3F0" w:sz="6"/>
+              <w:top w:val="single" w:color="C3CEDF" w:sz="6"/>
+              <w:left w:val="single" w:color="C3CEDF" w:sz="6"/>
+              <w:bottom w:val="single" w:color="C3CEDF" w:sz="6"/>
+              <w:right w:val="single" w:color="C3CEDF" w:sz="6"/>
             </w:tcBorders>
-            <w:shd w:fill="FDE4E1" w:color="auto" w:val="clear"/>
+            <w:shd w:fill="FBE3E1" w:color="auto" w:val="clear"/>
             <w:tcMar>
               <w:top w:type="dxa" w:w="90"/>
               <w:left w:type="dxa" w:w="120"/>
@@ -1479,7 +1479,7 @@
                 <w:rFonts w:ascii="微软雅黑" w:cs="微软雅黑" w:eastAsia="微软雅黑" w:hAnsi="微软雅黑"/>
                 <w:b/>
                 <w:bCs/>
-                <w:color w:val="C0392B"/>
+                <w:color w:val="B03A2E"/>
                 <w:sz w:val="21"/>
                 <w:szCs w:val="21"/>
               </w:rPr>
@@ -1491,10 +1491,10 @@
           <w:tcPr>
             <w:tcW w:type="dxa" w:w="2200"/>
             <w:tcBorders>
-              <w:top w:val="single" w:color="BCD3F0" w:sz="6"/>
-              <w:left w:val="single" w:color="BCD3F0" w:sz="6"/>
-              <w:bottom w:val="single" w:color="BCD3F0" w:sz="6"/>
-              <w:right w:val="single" w:color="BCD3F0" w:sz="6"/>
+              <w:top w:val="single" w:color="C3CEDF" w:sz="6"/>
+              <w:left w:val="single" w:color="C3CEDF" w:sz="6"/>
+              <w:bottom w:val="single" w:color="C3CEDF" w:sz="6"/>
+              <w:right w:val="single" w:color="C3CEDF" w:sz="6"/>
             </w:tcBorders>
             <w:shd w:fill="FFFFFF" w:color="auto" w:val="clear"/>
             <w:tcMar>
@@ -1527,10 +1527,10 @@
           <w:tcPr>
             <w:tcW w:type="dxa" w:w="2200"/>
             <w:tcBorders>
-              <w:top w:val="single" w:color="BCD3F0" w:sz="6"/>
-              <w:left w:val="single" w:color="BCD3F0" w:sz="6"/>
-              <w:bottom w:val="single" w:color="BCD3F0" w:sz="6"/>
-              <w:right w:val="single" w:color="BCD3F0" w:sz="6"/>
+              <w:top w:val="single" w:color="C3CEDF" w:sz="6"/>
+              <w:left w:val="single" w:color="C3CEDF" w:sz="6"/>
+              <w:bottom w:val="single" w:color="C3CEDF" w:sz="6"/>
+              <w:right w:val="single" w:color="C3CEDF" w:sz="6"/>
             </w:tcBorders>
             <w:shd w:fill="FFFFFF" w:color="auto" w:val="clear"/>
             <w:tcMar>
@@ -1563,10 +1563,10 @@
           <w:tcPr>
             <w:tcW w:type="dxa" w:w="2398"/>
             <w:tcBorders>
-              <w:top w:val="single" w:color="BCD3F0" w:sz="6"/>
-              <w:left w:val="single" w:color="BCD3F0" w:sz="6"/>
-              <w:bottom w:val="single" w:color="BCD3F0" w:sz="6"/>
-              <w:right w:val="single" w:color="BCD3F0" w:sz="6"/>
+              <w:top w:val="single" w:color="C3CEDF" w:sz="6"/>
+              <w:left w:val="single" w:color="C3CEDF" w:sz="6"/>
+              <w:bottom w:val="single" w:color="C3CEDF" w:sz="6"/>
+              <w:right w:val="single" w:color="C3CEDF" w:sz="6"/>
             </w:tcBorders>
             <w:shd w:fill="FFFFFF" w:color="auto" w:val="clear"/>
             <w:tcMar>
@@ -1604,12 +1604,12 @@
           <w:tcPr>
             <w:tcW w:type="dxa" w:w="2500"/>
             <w:tcBorders>
-              <w:top w:val="single" w:color="BCD3F0" w:sz="6"/>
-              <w:left w:val="single" w:color="BCD3F0" w:sz="6"/>
-              <w:bottom w:val="single" w:color="BCD3F0" w:sz="6"/>
-              <w:right w:val="single" w:color="BCD3F0" w:sz="6"/>
+              <w:top w:val="single" w:color="C3CEDF" w:sz="6"/>
+              <w:left w:val="single" w:color="C3CEDF" w:sz="6"/>
+              <w:bottom w:val="single" w:color="C3CEDF" w:sz="6"/>
+              <w:right w:val="single" w:color="C3CEDF" w:sz="6"/>
             </w:tcBorders>
-            <w:shd w:fill="E3EEFB" w:color="auto" w:val="clear"/>
+            <w:shd w:fill="E3ECF8" w:color="auto" w:val="clear"/>
             <w:tcMar>
               <w:top w:type="dxa" w:w="90"/>
               <w:left w:type="dxa" w:w="120"/>
@@ -1640,10 +1640,10 @@
           <w:tcPr>
             <w:tcW w:type="dxa" w:w="2200"/>
             <w:tcBorders>
-              <w:top w:val="single" w:color="BCD3F0" w:sz="6"/>
-              <w:left w:val="single" w:color="BCD3F0" w:sz="6"/>
-              <w:bottom w:val="single" w:color="BCD3F0" w:sz="6"/>
-              <w:right w:val="single" w:color="BCD3F0" w:sz="6"/>
+              <w:top w:val="single" w:color="C3CEDF" w:sz="6"/>
+              <w:left w:val="single" w:color="C3CEDF" w:sz="6"/>
+              <w:bottom w:val="single" w:color="C3CEDF" w:sz="6"/>
+              <w:right w:val="single" w:color="C3CEDF" w:sz="6"/>
             </w:tcBorders>
             <w:shd w:fill="FFFFFF" w:color="auto" w:val="clear"/>
             <w:tcMar>
@@ -1676,10 +1676,10 @@
           <w:tcPr>
             <w:tcW w:type="dxa" w:w="2200"/>
             <w:tcBorders>
-              <w:top w:val="single" w:color="BCD3F0" w:sz="6"/>
-              <w:left w:val="single" w:color="BCD3F0" w:sz="6"/>
-              <w:bottom w:val="single" w:color="BCD3F0" w:sz="6"/>
-              <w:right w:val="single" w:color="BCD3F0" w:sz="6"/>
+              <w:top w:val="single" w:color="C3CEDF" w:sz="6"/>
+              <w:left w:val="single" w:color="C3CEDF" w:sz="6"/>
+              <w:bottom w:val="single" w:color="C3CEDF" w:sz="6"/>
+              <w:right w:val="single" w:color="C3CEDF" w:sz="6"/>
             </w:tcBorders>
             <w:shd w:fill="FFFFFF" w:color="auto" w:val="clear"/>
             <w:tcMar>
@@ -1712,10 +1712,10 @@
           <w:tcPr>
             <w:tcW w:type="dxa" w:w="2398"/>
             <w:tcBorders>
-              <w:top w:val="single" w:color="BCD3F0" w:sz="6"/>
-              <w:left w:val="single" w:color="BCD3F0" w:sz="6"/>
-              <w:bottom w:val="single" w:color="BCD3F0" w:sz="6"/>
-              <w:right w:val="single" w:color="BCD3F0" w:sz="6"/>
+              <w:top w:val="single" w:color="C3CEDF" w:sz="6"/>
+              <w:left w:val="single" w:color="C3CEDF" w:sz="6"/>
+              <w:bottom w:val="single" w:color="C3CEDF" w:sz="6"/>
+              <w:right w:val="single" w:color="C3CEDF" w:sz="6"/>
             </w:tcBorders>
             <w:shd w:fill="FFFFFF" w:color="auto" w:val="clear"/>
             <w:tcMar>
@@ -1764,7 +1764,7 @@
           <w:rFonts w:ascii="微软雅黑" w:cs="微软雅黑" w:eastAsia="微软雅黑" w:hAnsi="微软雅黑"/>
           <w:b/>
           <w:bCs/>
-          <w:color w:val="0B4B9B"/>
+          <w:color w:val="1E3460"/>
           <w:sz w:val="24"/>
           <w:szCs w:val="24"/>
         </w:rPr>
@@ -1795,7 +1795,7 @@
           <w:rFonts w:ascii="微软雅黑" w:cs="微软雅黑" w:eastAsia="微软雅黑" w:hAnsi="微软雅黑"/>
           <w:b/>
           <w:bCs/>
-          <w:color w:val="D9700F"/>
+          <w:color w:val="C8423B"/>
           <w:sz w:val="24"/>
           <w:szCs w:val="24"/>
         </w:rPr>
@@ -1806,7 +1806,7 @@
           <w:rFonts w:ascii="Times New Roman" w:cs="Times New Roman" w:eastAsia="宋体" w:hAnsi="Times New Roman"/>
           <w:b/>
           <w:bCs/>
-          <w:color w:val="0B4B9B"/>
+          <w:color w:val="1E3460"/>
           <w:sz w:val="24"/>
           <w:szCs w:val="24"/>
         </w:rPr>
@@ -1827,11 +1827,10 @@
     <w:p>
       <w:pPr>
         <w:pBdr>
-          <w:top w:val="single" w:color="EDF4FD" w:sz="4" w:space="4"/>
-          <w:left w:val="single" w:color="0B4B9B" w:sz="36" w:space="8"/>
-          <w:bottom w:val="single" w:color="EDF4FD" w:sz="4" w:space="4"/>
+          <w:top w:val="double" w:color="6E6E6E" w:sz="6" w:space="4"/>
+          <w:bottom w:val="double" w:color="6E6E6E" w:sz="6" w:space="4"/>
         </w:pBdr>
-        <w:shd w:fill="EDF4FD" w:color="auto" w:val="clear"/>
+        <w:shd w:fill="F3F2EE" w:color="auto" w:val="clear"/>
         <w:spacing w:after="120" w:before="100" w:line="340" w:lineRule="auto"/>
         <w:ind w:left="140" w:right="140"/>
         <w:jc w:val="both"/>
@@ -1839,7 +1838,7 @@
       <w:r>
         <w:drawing>
           <wp:inline distT="0" distB="0" distL="0" distR="0">
-            <wp:extent cx="228600" cy="228600"/>
+            <wp:extent cx="247650" cy="209550"/>
             <wp:effectExtent t="0" r="0" b="0" l="0"/>
             <wp:docPr id="114" name="新闻" descr="新闻" title="新闻"/>
             <wp:cNvGraphicFramePr>
@@ -1864,7 +1863,7 @@
                   <pic:spPr bwMode="auto">
                     <a:xfrm>
                       <a:off x="0" y="0"/>
-                      <a:ext cx="228600" cy="228600"/>
+                      <a:ext cx="247650" cy="209550"/>
                     </a:xfrm>
                     <a:prstGeom prst="rect">
                       <a:avLst/>
@@ -1881,7 +1880,7 @@
           <w:rFonts w:ascii="微软雅黑" w:cs="微软雅黑" w:eastAsia="微软雅黑" w:hAnsi="微软雅黑"/>
           <w:b/>
           <w:bCs/>
-          <w:color w:val="D9700F"/>
+          <w:color w:val="C8423B"/>
           <w:sz w:val="24"/>
           <w:szCs w:val="24"/>
         </w:rPr>
@@ -1892,7 +1891,7 @@
           <w:rFonts w:ascii="Times New Roman" w:cs="Times New Roman" w:eastAsia="宋体" w:hAnsi="Times New Roman"/>
           <w:b/>
           <w:bCs/>
-          <w:color w:val="0B4B9B"/>
+          <w:color w:val="1E3460"/>
           <w:sz w:val="24"/>
           <w:szCs w:val="24"/>
         </w:rPr>
@@ -1914,14 +1913,14 @@
       <w:pPr>
         <w:keepNext/>
         <w:pBdr>
-          <w:bottom w:val="dotted" w:color="FFCC39" w:sz="12" w:space="3"/>
+          <w:bottom w:val="single" w:color="C9D3E3" w:sz="6" w:space="3"/>
         </w:pBdr>
         <w:spacing w:after="100" w:before="220" w:line="300" w:lineRule="auto"/>
       </w:pPr>
       <w:r>
         <w:drawing>
           <wp:inline distT="0" distB="0" distL="0" distR="0">
-            <wp:extent cx="209550" cy="209550"/>
+            <wp:extent cx="190500" cy="190500"/>
             <wp:effectExtent t="0" r="0" b="0" l="0"/>
             <wp:docPr id="115" name="活动" descr="活动" title="活动"/>
             <wp:cNvGraphicFramePr>
@@ -1946,7 +1945,7 @@
                   <pic:spPr bwMode="auto">
                     <a:xfrm>
                       <a:off x="0" y="0"/>
-                      <a:ext cx="209550" cy="209550"/>
+                      <a:ext cx="190500" cy="190500"/>
                     </a:xfrm>
                     <a:prstGeom prst="rect">
                       <a:avLst/>
@@ -1963,7 +1962,7 @@
           <w:rFonts w:ascii="微软雅黑" w:cs="微软雅黑" w:eastAsia="微软雅黑" w:hAnsi="微软雅黑"/>
           <w:b/>
           <w:bCs/>
-          <w:color w:val="F2994A"/>
+          <w:color w:val="D9534F"/>
           <w:sz w:val="26"/>
           <w:szCs w:val="26"/>
         </w:rPr>
@@ -1974,7 +1973,7 @@
           <w:rFonts w:ascii="微软雅黑" w:cs="微软雅黑" w:eastAsia="微软雅黑" w:hAnsi="微软雅黑"/>
           <w:b/>
           <w:bCs/>
-          <w:color w:val="12346E"/>
+          <w:color w:val="1E3460"/>
           <w:sz w:val="26"/>
           <w:szCs w:val="26"/>
         </w:rPr>
@@ -1994,7 +1993,7 @@
           <w:rFonts w:ascii="微软雅黑" w:cs="微软雅黑" w:eastAsia="微软雅黑" w:hAnsi="微软雅黑"/>
           <w:b/>
           <w:bCs/>
-          <w:color w:val="D9700F"/>
+          <w:color w:val="C8423B"/>
           <w:sz w:val="24"/>
           <w:szCs w:val="24"/>
         </w:rPr>
@@ -2005,7 +2004,7 @@
           <w:rFonts w:ascii="Times New Roman" w:cs="Times New Roman" w:eastAsia="宋体" w:hAnsi="Times New Roman"/>
           <w:b/>
           <w:bCs/>
-          <w:color w:val="0B4B9B"/>
+          <w:color w:val="1E3460"/>
           <w:sz w:val="24"/>
           <w:szCs w:val="24"/>
         </w:rPr>
@@ -2036,7 +2035,7 @@
           <w:rFonts w:ascii="微软雅黑" w:cs="微软雅黑" w:eastAsia="微软雅黑" w:hAnsi="微软雅黑"/>
           <w:b/>
           <w:bCs/>
-          <w:color w:val="D9700F"/>
+          <w:color w:val="C8423B"/>
           <w:sz w:val="24"/>
           <w:szCs w:val="24"/>
         </w:rPr>
@@ -2057,11 +2056,10 @@
     <w:p>
       <w:pPr>
         <w:pBdr>
-          <w:top w:val="single" w:color="EDF4FD" w:sz="4" w:space="4"/>
-          <w:left w:val="single" w:color="0B4B9B" w:sz="36" w:space="8"/>
-          <w:bottom w:val="single" w:color="EDF4FD" w:sz="4" w:space="4"/>
+          <w:top w:val="double" w:color="6E6E6E" w:sz="6" w:space="4"/>
+          <w:bottom w:val="double" w:color="6E6E6E" w:sz="6" w:space="4"/>
         </w:pBdr>
-        <w:shd w:fill="EDF4FD" w:color="auto" w:val="clear"/>
+        <w:shd w:fill="F3F2EE" w:color="auto" w:val="clear"/>
         <w:spacing w:after="120" w:before="100" w:line="340" w:lineRule="auto"/>
         <w:ind w:left="140" w:right="140"/>
         <w:jc w:val="both"/>
@@ -2069,7 +2067,7 @@
       <w:r>
         <w:drawing>
           <wp:inline distT="0" distB="0" distL="0" distR="0">
-            <wp:extent cx="228600" cy="228600"/>
+            <wp:extent cx="247650" cy="209550"/>
             <wp:effectExtent t="0" r="0" b="0" l="0"/>
             <wp:docPr id="116" name="新闻" descr="新闻" title="新闻"/>
             <wp:cNvGraphicFramePr>
@@ -2094,7 +2092,7 @@
                   <pic:spPr bwMode="auto">
                     <a:xfrm>
                       <a:off x="0" y="0"/>
-                      <a:ext cx="228600" cy="228600"/>
+                      <a:ext cx="247650" cy="209550"/>
                     </a:xfrm>
                     <a:prstGeom prst="rect">
                       <a:avLst/>
@@ -2111,7 +2109,7 @@
           <w:rFonts w:ascii="微软雅黑" w:cs="微软雅黑" w:eastAsia="微软雅黑" w:hAnsi="微软雅黑"/>
           <w:b/>
           <w:bCs/>
-          <w:color w:val="D9700F"/>
+          <w:color w:val="C8423B"/>
           <w:sz w:val="24"/>
           <w:szCs w:val="24"/>
         </w:rPr>
@@ -2122,7 +2120,7 @@
           <w:rFonts w:ascii="Times New Roman" w:cs="Times New Roman" w:eastAsia="宋体" w:hAnsi="Times New Roman"/>
           <w:b/>
           <w:bCs/>
-          <w:color w:val="0B4B9B"/>
+          <w:color w:val="1E3460"/>
           <w:sz w:val="24"/>
           <w:szCs w:val="24"/>
         </w:rPr>
@@ -2153,7 +2151,7 @@
           <w:rFonts w:ascii="微软雅黑" w:cs="微软雅黑" w:eastAsia="微软雅黑" w:hAnsi="微软雅黑"/>
           <w:b/>
           <w:bCs/>
-          <w:color w:val="0B4B9B"/>
+          <w:color w:val="1E3460"/>
           <w:sz w:val="24"/>
           <w:szCs w:val="24"/>
         </w:rPr>
@@ -2174,14 +2172,14 @@
     <w:p>
       <w:pPr>
         <w:pBdr>
-          <w:top w:val="dashed" w:color="F5B041" w:sz="8" w:space="6"/>
-          <w:left w:val="dashed" w:color="F5B041" w:sz="8" w:space="6"/>
-          <w:bottom w:val="dashed" w:color="F5B041" w:sz="8" w:space="6"/>
-          <w:right w:val="dashed" w:color="F5B041" w:sz="8" w:space="6"/>
+          <w:top w:val="single" w:color="FFF6D5" w:sz="4" w:space="5"/>
+          <w:left w:val="single" w:color="F2B705" w:sz="36" w:space="10"/>
+          <w:bottom w:val="single" w:color="FFF6D5" w:sz="4" w:space="5"/>
+          <w:right w:val="single" w:color="FFF6D5" w:sz="4" w:space="5"/>
         </w:pBdr>
-        <w:shd w:fill="FFF7E1" w:color="auto" w:val="clear"/>
+        <w:shd w:fill="FFF6D5" w:color="auto" w:val="clear"/>
         <w:spacing w:after="160" w:before="200" w:line="440" w:lineRule="exact"/>
-        <w:ind w:left="140" w:right="140"/>
+        <w:ind w:left="200" w:right="120"/>
         <w:jc w:val="both"/>
       </w:pPr>
       <w:r>
@@ -2189,7 +2187,7 @@
           <w:rFonts w:ascii="Times New Roman" w:cs="Times New Roman" w:eastAsia="楷体" w:hAnsi="Times New Roman"/>
           <w:b/>
           <w:bCs/>
-          <w:color w:val="D9700F"/>
+          <w:color w:val="C8423B"/>
           <w:sz w:val="24"/>
           <w:szCs w:val="24"/>
         </w:rPr>
@@ -2200,7 +2198,7 @@
           <w:rFonts w:ascii="Times New Roman" w:cs="Times New Roman" w:eastAsia="楷体" w:hAnsi="Times New Roman"/>
           <w:b w:val="false"/>
           <w:bCs w:val="false"/>
-          <w:color w:val="4A3B2A"/>
+          <w:color w:val="3D3D3D"/>
           <w:sz w:val="24"/>
           <w:szCs w:val="24"/>
         </w:rPr>
@@ -2210,13 +2208,13 @@
     <w:p>
       <w:pPr>
         <w:keepNext/>
-        <w:spacing w:after="160" w:before="320" w:line="240" w:lineRule="auto"/>
+        <w:spacing w:after="140" w:before="300" w:line="240" w:lineRule="auto"/>
         <w:jc w:val="center"/>
       </w:pPr>
       <w:r>
         <w:drawing>
           <wp:inline distT="0" distB="0" distL="0" distR="0">
-            <wp:extent cx="5581650" cy="723900"/>
+            <wp:extent cx="5553075" cy="857250"/>
             <wp:effectExtent t="0" r="0" b="0" l="0"/>
             <wp:docPr id="117" name="环节三  解密码·立守护之法" descr="环节三  解密码·立守护之法" title="环节三  解密码·立守护之法"/>
             <wp:cNvGraphicFramePr>
@@ -2241,7 +2239,7 @@
                   <pic:spPr bwMode="auto">
                     <a:xfrm>
                       <a:off x="0" y="0"/>
-                      <a:ext cx="5581650" cy="723900"/>
+                      <a:ext cx="5553075" cy="857250"/>
                     </a:xfrm>
                     <a:prstGeom prst="rect">
                       <a:avLst/>
@@ -2258,14 +2256,14 @@
       <w:pPr>
         <w:keepNext/>
         <w:pBdr>
-          <w:bottom w:val="dotted" w:color="FFCC39" w:sz="12" w:space="3"/>
+          <w:bottom w:val="single" w:color="C9D3E3" w:sz="6" w:space="3"/>
         </w:pBdr>
         <w:spacing w:after="100" w:before="220" w:line="300" w:lineRule="auto"/>
       </w:pPr>
       <w:r>
         <w:drawing>
           <wp:inline distT="0" distB="0" distL="0" distR="0">
-            <wp:extent cx="209550" cy="209550"/>
+            <wp:extent cx="190500" cy="190500"/>
             <wp:effectExtent t="0" r="0" b="0" l="0"/>
             <wp:docPr id="118" name="活动" descr="活动" title="活动"/>
             <wp:cNvGraphicFramePr>
@@ -2290,7 +2288,7 @@
                   <pic:spPr bwMode="auto">
                     <a:xfrm>
                       <a:off x="0" y="0"/>
-                      <a:ext cx="209550" cy="209550"/>
+                      <a:ext cx="190500" cy="190500"/>
                     </a:xfrm>
                     <a:prstGeom prst="rect">
                       <a:avLst/>
@@ -2307,7 +2305,7 @@
           <w:rFonts w:ascii="微软雅黑" w:cs="微软雅黑" w:eastAsia="微软雅黑" w:hAnsi="微软雅黑"/>
           <w:b/>
           <w:bCs/>
-          <w:color w:val="34B37E"/>
+          <w:color w:val="2A9D8F"/>
           <w:sz w:val="26"/>
           <w:szCs w:val="26"/>
         </w:rPr>
@@ -2318,7 +2316,7 @@
           <w:rFonts w:ascii="微软雅黑" w:cs="微软雅黑" w:eastAsia="微软雅黑" w:hAnsi="微软雅黑"/>
           <w:b/>
           <w:bCs/>
-          <w:color w:val="12346E"/>
+          <w:color w:val="1E3460"/>
           <w:sz w:val="26"/>
           <w:szCs w:val="26"/>
         </w:rPr>
@@ -2348,12 +2346,12 @@
     <w:p>
       <w:pPr>
         <w:pBdr>
-          <w:top w:val="dashed" w:color="F08A24" w:sz="12" w:space="8"/>
-          <w:left w:val="dashed" w:color="F08A24" w:sz="12" w:space="8"/>
-          <w:bottom w:val="dashed" w:color="F08A24" w:sz="12" w:space="8"/>
-          <w:right w:val="dashed" w:color="F08A24" w:sz="12" w:space="8"/>
+          <w:top w:val="single" w:color="1E3460" w:sz="4" w:space="8"/>
+          <w:left w:val="single" w:color="1E3460" w:sz="4" w:space="8"/>
+          <w:bottom w:val="single" w:color="1E3460" w:sz="4" w:space="8"/>
+          <w:right w:val="single" w:color="1E3460" w:sz="4" w:space="8"/>
         </w:pBdr>
-        <w:shd w:fill="FFF3C4" w:color="auto" w:val="clear"/>
+        <w:shd w:fill="1E3460" w:color="auto" w:val="clear"/>
         <w:spacing w:after="200" w:before="160" w:line="600" w:lineRule="exact"/>
         <w:ind w:left="700" w:right="700"/>
         <w:jc w:val="center"/>
@@ -2363,7 +2361,7 @@
           <w:rFonts w:ascii="Times New Roman" w:cs="Times New Roman" w:eastAsia="楷体" w:hAnsi="Times New Roman"/>
           <w:b/>
           <w:bCs/>
-          <w:color w:val="12346E"/>
+          <w:color w:val="F2B705"/>
           <w:sz w:val="28"/>
           <w:szCs w:val="28"/>
         </w:rPr>
@@ -2374,14 +2372,14 @@
       <w:pPr>
         <w:keepNext/>
         <w:pBdr>
-          <w:bottom w:val="dotted" w:color="FFCC39" w:sz="12" w:space="3"/>
+          <w:bottom w:val="single" w:color="C9D3E3" w:sz="6" w:space="3"/>
         </w:pBdr>
         <w:spacing w:after="100" w:before="220" w:line="300" w:lineRule="auto"/>
       </w:pPr>
       <w:r>
         <w:drawing>
           <wp:inline distT="0" distB="0" distL="0" distR="0">
-            <wp:extent cx="209550" cy="209550"/>
+            <wp:extent cx="190500" cy="190500"/>
             <wp:effectExtent t="0" r="0" b="0" l="0"/>
             <wp:docPr id="119" name="活动" descr="活动" title="活动"/>
             <wp:cNvGraphicFramePr>
@@ -2406,7 +2404,7 @@
                   <pic:spPr bwMode="auto">
                     <a:xfrm>
                       <a:off x="0" y="0"/>
-                      <a:ext cx="209550" cy="209550"/>
+                      <a:ext cx="190500" cy="190500"/>
                     </a:xfrm>
                     <a:prstGeom prst="rect">
                       <a:avLst/>
@@ -2423,7 +2421,7 @@
           <w:rFonts w:ascii="微软雅黑" w:cs="微软雅黑" w:eastAsia="微软雅黑" w:hAnsi="微软雅黑"/>
           <w:b/>
           <w:bCs/>
-          <w:color w:val="34B37E"/>
+          <w:color w:val="2A9D8F"/>
           <w:sz w:val="26"/>
           <w:szCs w:val="26"/>
         </w:rPr>
@@ -2434,7 +2432,7 @@
           <w:rFonts w:ascii="微软雅黑" w:cs="微软雅黑" w:eastAsia="微软雅黑" w:hAnsi="微软雅黑"/>
           <w:b/>
           <w:bCs/>
-          <w:color w:val="12346E"/>
+          <w:color w:val="1E3460"/>
           <w:sz w:val="26"/>
           <w:szCs w:val="26"/>
         </w:rPr>
@@ -2464,12 +2462,12 @@
     <w:p>
       <w:pPr>
         <w:pBdr>
-          <w:top w:val="dashed" w:color="F08A24" w:sz="12" w:space="8"/>
-          <w:left w:val="dashed" w:color="F08A24" w:sz="12" w:space="8"/>
-          <w:bottom w:val="dashed" w:color="F08A24" w:sz="12" w:space="8"/>
-          <w:right w:val="dashed" w:color="F08A24" w:sz="12" w:space="8"/>
+          <w:top w:val="single" w:color="1E3460" w:sz="4" w:space="8"/>
+          <w:left w:val="single" w:color="1E3460" w:sz="4" w:space="8"/>
+          <w:bottom w:val="single" w:color="1E3460" w:sz="4" w:space="8"/>
+          <w:right w:val="single" w:color="1E3460" w:sz="4" w:space="8"/>
         </w:pBdr>
-        <w:shd w:fill="FFF3C4" w:color="auto" w:val="clear"/>
+        <w:shd w:fill="1E3460" w:color="auto" w:val="clear"/>
         <w:spacing w:after="200" w:before="160" w:line="600" w:lineRule="exact"/>
         <w:ind w:left="700" w:right="700"/>
         <w:jc w:val="center"/>
@@ -2479,7 +2477,7 @@
           <w:rFonts w:ascii="Times New Roman" w:cs="Times New Roman" w:eastAsia="楷体" w:hAnsi="Times New Roman"/>
           <w:b/>
           <w:bCs/>
-          <w:color w:val="12346E"/>
+          <w:color w:val="F2B705"/>
           <w:sz w:val="28"/>
           <w:szCs w:val="28"/>
         </w:rPr>
@@ -2490,7 +2488,7 @@
           <w:rFonts w:ascii="Times New Roman" w:cs="Times New Roman" w:eastAsia="楷体" w:hAnsi="Times New Roman"/>
           <w:b/>
           <w:bCs/>
-          <w:color w:val="12346E"/>
+          <w:color w:val="F2B705"/>
           <w:sz w:val="28"/>
           <w:szCs w:val="28"/>
         </w:rPr>
@@ -2502,7 +2500,7 @@
           <w:rFonts w:ascii="Times New Roman" w:cs="Times New Roman" w:eastAsia="楷体" w:hAnsi="Times New Roman"/>
           <w:b/>
           <w:bCs/>
-          <w:color w:val="12346E"/>
+          <w:color w:val="F2B705"/>
           <w:sz w:val="28"/>
           <w:szCs w:val="28"/>
         </w:rPr>
@@ -2523,7 +2521,7 @@
           <w:rFonts w:ascii="Times New Roman" w:cs="Times New Roman" w:eastAsia="宋体" w:hAnsi="Times New Roman"/>
           <w:b/>
           <w:bCs/>
-          <w:color w:val="0B4B9B"/>
+          <w:color w:val="1E3460"/>
           <w:sz w:val="24"/>
           <w:szCs w:val="24"/>
         </w:rPr>
@@ -2554,7 +2552,7 @@
           <w:rFonts w:ascii="微软雅黑" w:cs="微软雅黑" w:eastAsia="微软雅黑" w:hAnsi="微软雅黑"/>
           <w:b/>
           <w:bCs/>
-          <w:color w:val="0B4B9B"/>
+          <w:color w:val="1E3460"/>
           <w:sz w:val="24"/>
           <w:szCs w:val="24"/>
         </w:rPr>
@@ -2575,14 +2573,14 @@
     <w:p>
       <w:pPr>
         <w:pBdr>
-          <w:top w:val="dashed" w:color="F5B041" w:sz="8" w:space="6"/>
-          <w:left w:val="dashed" w:color="F5B041" w:sz="8" w:space="6"/>
-          <w:bottom w:val="dashed" w:color="F5B041" w:sz="8" w:space="6"/>
-          <w:right w:val="dashed" w:color="F5B041" w:sz="8" w:space="6"/>
+          <w:top w:val="single" w:color="FFF6D5" w:sz="4" w:space="5"/>
+          <w:left w:val="single" w:color="F2B705" w:sz="36" w:space="10"/>
+          <w:bottom w:val="single" w:color="FFF6D5" w:sz="4" w:space="5"/>
+          <w:right w:val="single" w:color="FFF6D5" w:sz="4" w:space="5"/>
         </w:pBdr>
-        <w:shd w:fill="FFF7E1" w:color="auto" w:val="clear"/>
+        <w:shd w:fill="FFF6D5" w:color="auto" w:val="clear"/>
         <w:spacing w:after="160" w:before="200" w:line="440" w:lineRule="exact"/>
-        <w:ind w:left="140" w:right="140"/>
+        <w:ind w:left="200" w:right="120"/>
         <w:jc w:val="both"/>
       </w:pPr>
       <w:r>
@@ -2590,7 +2588,7 @@
           <w:rFonts w:ascii="Times New Roman" w:cs="Times New Roman" w:eastAsia="楷体" w:hAnsi="Times New Roman"/>
           <w:b/>
           <w:bCs/>
-          <w:color w:val="D9700F"/>
+          <w:color w:val="C8423B"/>
           <w:sz w:val="24"/>
           <w:szCs w:val="24"/>
         </w:rPr>
@@ -2601,7 +2599,7 @@
           <w:rFonts w:ascii="Times New Roman" w:cs="Times New Roman" w:eastAsia="楷体" w:hAnsi="Times New Roman"/>
           <w:b w:val="false"/>
           <w:bCs w:val="false"/>
-          <w:color w:val="4A3B2A"/>
+          <w:color w:val="3D3D3D"/>
           <w:sz w:val="24"/>
           <w:szCs w:val="24"/>
         </w:rPr>
@@ -2611,13 +2609,13 @@
     <w:p>
       <w:pPr>
         <w:keepNext/>
-        <w:spacing w:after="160" w:before="320" w:line="240" w:lineRule="auto"/>
+        <w:spacing w:after="140" w:before="300" w:line="240" w:lineRule="auto"/>
         <w:jc w:val="center"/>
       </w:pPr>
       <w:r>
         <w:drawing>
           <wp:inline distT="0" distB="0" distL="0" distR="0">
-            <wp:extent cx="5581650" cy="723900"/>
+            <wp:extent cx="5553075" cy="857250"/>
             <wp:effectExtent t="0" r="0" b="0" l="0"/>
             <wp:docPr id="120" name="环节四  守勋章·践文明之美" descr="环节四  守勋章·践文明之美" title="环节四  守勋章·践文明之美"/>
             <wp:cNvGraphicFramePr>
@@ -2642,7 +2640,7 @@
                   <pic:spPr bwMode="auto">
                     <a:xfrm>
                       <a:off x="0" y="0"/>
-                      <a:ext cx="5581650" cy="723900"/>
+                      <a:ext cx="5553075" cy="857250"/>
                     </a:xfrm>
                     <a:prstGeom prst="rect">
                       <a:avLst/>
@@ -2659,14 +2657,14 @@
       <w:pPr>
         <w:keepNext/>
         <w:pBdr>
-          <w:bottom w:val="dotted" w:color="FFCC39" w:sz="12" w:space="3"/>
+          <w:bottom w:val="single" w:color="C9D3E3" w:sz="6" w:space="3"/>
         </w:pBdr>
         <w:spacing w:after="100" w:before="220" w:line="300" w:lineRule="auto"/>
       </w:pPr>
       <w:r>
         <w:drawing>
           <wp:inline distT="0" distB="0" distL="0" distR="0">
-            <wp:extent cx="209550" cy="209550"/>
+            <wp:extent cx="190500" cy="190500"/>
             <wp:effectExtent t="0" r="0" b="0" l="0"/>
             <wp:docPr id="121" name="活动" descr="活动" title="活动"/>
             <wp:cNvGraphicFramePr>
@@ -2691,7 +2689,7 @@
                   <pic:spPr bwMode="auto">
                     <a:xfrm>
                       <a:off x="0" y="0"/>
-                      <a:ext cx="209550" cy="209550"/>
+                      <a:ext cx="190500" cy="190500"/>
                     </a:xfrm>
                     <a:prstGeom prst="rect">
                       <a:avLst/>
@@ -2708,7 +2706,7 @@
           <w:rFonts w:ascii="微软雅黑" w:cs="微软雅黑" w:eastAsia="微软雅黑" w:hAnsi="微软雅黑"/>
           <w:b/>
           <w:bCs/>
-          <w:color w:val="EE6A5F"/>
+          <w:color w:val="E89B0C"/>
           <w:sz w:val="26"/>
           <w:szCs w:val="26"/>
         </w:rPr>
@@ -2719,7 +2717,7 @@
           <w:rFonts w:ascii="微软雅黑" w:cs="微软雅黑" w:eastAsia="微软雅黑" w:hAnsi="微软雅黑"/>
           <w:b/>
           <w:bCs/>
-          <w:color w:val="12346E"/>
+          <w:color w:val="1E3460"/>
           <w:sz w:val="26"/>
           <w:szCs w:val="26"/>
         </w:rPr>
@@ -2735,7 +2733,7 @@
       <w:r>
         <w:drawing>
           <wp:inline distT="0" distB="0" distL="0" distR="0">
-            <wp:extent cx="133350" cy="133350"/>
+            <wp:extent cx="123825" cy="123825"/>
             <wp:effectExtent t="0" r="0" b="0" l="0"/>
             <wp:docPr id="122" name="要点" descr="要点" title="要点"/>
             <wp:cNvGraphicFramePr>
@@ -2760,7 +2758,7 @@
                   <pic:spPr bwMode="auto">
                     <a:xfrm>
                       <a:off x="0" y="0"/>
-                      <a:ext cx="133350" cy="133350"/>
+                      <a:ext cx="123825" cy="123825"/>
                     </a:xfrm>
                     <a:prstGeom prst="rect">
                       <a:avLst/>
@@ -2777,7 +2775,7 @@
           <w:rFonts w:ascii="微软雅黑" w:cs="微软雅黑" w:eastAsia="微软雅黑" w:hAnsi="微软雅黑"/>
           <w:b/>
           <w:bCs/>
-          <w:color w:val="D9700F"/>
+          <w:color w:val="1E3460"/>
           <w:sz w:val="24"/>
           <w:szCs w:val="24"/>
         </w:rPr>
@@ -2797,7 +2795,7 @@
           <w:rFonts w:ascii="Times New Roman" w:cs="Times New Roman" w:eastAsia="宋体" w:hAnsi="Times New Roman"/>
           <w:b/>
           <w:bCs/>
-          <w:color w:val="0B4B9B"/>
+          <w:color w:val="1E3460"/>
           <w:sz w:val="24"/>
           <w:szCs w:val="24"/>
         </w:rPr>
@@ -2828,7 +2826,7 @@
           <w:rFonts w:ascii="Times New Roman" w:cs="Times New Roman" w:eastAsia="宋体" w:hAnsi="Times New Roman"/>
           <w:b/>
           <w:bCs/>
-          <w:color w:val="0B4B9B"/>
+          <w:color w:val="1E3460"/>
           <w:sz w:val="24"/>
           <w:szCs w:val="24"/>
         </w:rPr>
@@ -2855,7 +2853,7 @@
       <w:r>
         <w:drawing>
           <wp:inline distT="0" distB="0" distL="0" distR="0">
-            <wp:extent cx="133350" cy="133350"/>
+            <wp:extent cx="123825" cy="123825"/>
             <wp:effectExtent t="0" r="0" b="0" l="0"/>
             <wp:docPr id="123" name="要点" descr="要点" title="要点"/>
             <wp:cNvGraphicFramePr>
@@ -2880,7 +2878,7 @@
                   <pic:spPr bwMode="auto">
                     <a:xfrm>
                       <a:off x="0" y="0"/>
-                      <a:ext cx="133350" cy="133350"/>
+                      <a:ext cx="123825" cy="123825"/>
                     </a:xfrm>
                     <a:prstGeom prst="rect">
                       <a:avLst/>
@@ -2897,7 +2895,7 @@
           <w:rFonts w:ascii="微软雅黑" w:cs="微软雅黑" w:eastAsia="微软雅黑" w:hAnsi="微软雅黑"/>
           <w:b/>
           <w:bCs/>
-          <w:color w:val="D9700F"/>
+          <w:color w:val="1E3460"/>
           <w:sz w:val="24"/>
           <w:szCs w:val="24"/>
         </w:rPr>
@@ -2917,7 +2915,7 @@
           <w:rFonts w:ascii="Times New Roman" w:cs="Times New Roman" w:eastAsia="宋体" w:hAnsi="Times New Roman"/>
           <w:b/>
           <w:bCs/>
-          <w:color w:val="0B4B9B"/>
+          <w:color w:val="1E3460"/>
           <w:sz w:val="24"/>
           <w:szCs w:val="24"/>
         </w:rPr>
@@ -2948,7 +2946,7 @@
           <w:rFonts w:ascii="Times New Roman" w:cs="Times New Roman" w:eastAsia="宋体" w:hAnsi="Times New Roman"/>
           <w:b/>
           <w:bCs/>
-          <w:color w:val="0B4B9B"/>
+          <w:color w:val="1E3460"/>
           <w:sz w:val="24"/>
           <w:szCs w:val="24"/>
         </w:rPr>
@@ -2979,7 +2977,7 @@
           <w:rFonts w:ascii="Times New Roman" w:cs="Times New Roman" w:eastAsia="宋体" w:hAnsi="Times New Roman"/>
           <w:b/>
           <w:bCs/>
-          <w:color w:val="0B4B9B"/>
+          <w:color w:val="1E3460"/>
           <w:sz w:val="24"/>
           <w:szCs w:val="24"/>
         </w:rPr>
@@ -3030,12 +3028,12 @@
           <w:tcPr>
             <w:tcW w:type="dxa" w:w="3500"/>
             <w:tcBorders>
-              <w:top w:val="single" w:color="F5D6A8" w:sz="6"/>
-              <w:left w:val="single" w:color="F5D6A8" w:sz="6"/>
-              <w:bottom w:val="single" w:color="F5D6A8" w:sz="6"/>
-              <w:right w:val="single" w:color="F5D6A8" w:sz="6"/>
+              <w:top w:val="single" w:color="E8D9B8" w:sz="6"/>
+              <w:left w:val="single" w:color="E8D9B8" w:sz="6"/>
+              <w:bottom w:val="single" w:color="E8D9B8" w:sz="6"/>
+              <w:right w:val="single" w:color="E8D9B8" w:sz="6"/>
             </w:tcBorders>
-            <w:shd w:fill="F08A24" w:color="auto" w:val="clear"/>
+            <w:shd w:fill="E89B0C" w:color="auto" w:val="clear"/>
             <w:tcMar>
               <w:top w:type="dxa" w:w="90"/>
               <w:left w:type="dxa" w:w="120"/>
@@ -3066,12 +3064,12 @@
           <w:tcPr>
             <w:tcW w:type="dxa" w:w="3900"/>
             <w:tcBorders>
-              <w:top w:val="single" w:color="F5D6A8" w:sz="6"/>
-              <w:left w:val="single" w:color="F5D6A8" w:sz="6"/>
-              <w:bottom w:val="single" w:color="F5D6A8" w:sz="6"/>
-              <w:right w:val="single" w:color="F5D6A8" w:sz="6"/>
+              <w:top w:val="single" w:color="E8D9B8" w:sz="6"/>
+              <w:left w:val="single" w:color="E8D9B8" w:sz="6"/>
+              <w:bottom w:val="single" w:color="E8D9B8" w:sz="6"/>
+              <w:right w:val="single" w:color="E8D9B8" w:sz="6"/>
             </w:tcBorders>
-            <w:shd w:fill="F08A24" w:color="auto" w:val="clear"/>
+            <w:shd w:fill="E89B0C" w:color="auto" w:val="clear"/>
             <w:tcMar>
               <w:top w:type="dxa" w:w="90"/>
               <w:left w:type="dxa" w:w="120"/>
@@ -3102,12 +3100,12 @@
           <w:tcPr>
             <w:tcW w:type="dxa" w:w="1898"/>
             <w:tcBorders>
-              <w:top w:val="single" w:color="F5D6A8" w:sz="6"/>
-              <w:left w:val="single" w:color="F5D6A8" w:sz="6"/>
-              <w:bottom w:val="single" w:color="F5D6A8" w:sz="6"/>
-              <w:right w:val="single" w:color="F5D6A8" w:sz="6"/>
+              <w:top w:val="single" w:color="E8D9B8" w:sz="6"/>
+              <w:left w:val="single" w:color="E8D9B8" w:sz="6"/>
+              <w:bottom w:val="single" w:color="E8D9B8" w:sz="6"/>
+              <w:right w:val="single" w:color="E8D9B8" w:sz="6"/>
             </w:tcBorders>
-            <w:shd w:fill="F08A24" w:color="auto" w:val="clear"/>
+            <w:shd w:fill="E89B0C" w:color="auto" w:val="clear"/>
             <w:tcMar>
               <w:top w:type="dxa" w:w="90"/>
               <w:left w:type="dxa" w:w="120"/>
@@ -3143,10 +3141,10 @@
           <w:tcPr>
             <w:tcW w:type="dxa" w:w="3500"/>
             <w:tcBorders>
-              <w:top w:val="single" w:color="F5D6A8" w:sz="6"/>
-              <w:left w:val="single" w:color="F5D6A8" w:sz="6"/>
-              <w:bottom w:val="single" w:color="F5D6A8" w:sz="6"/>
-              <w:right w:val="single" w:color="F5D6A8" w:sz="6"/>
+              <w:top w:val="single" w:color="E8D9B8" w:sz="6"/>
+              <w:left w:val="single" w:color="E8D9B8" w:sz="6"/>
+              <w:bottom w:val="single" w:color="E8D9B8" w:sz="6"/>
+              <w:right w:val="single" w:color="E8D9B8" w:sz="6"/>
             </w:tcBorders>
             <w:shd w:fill="FFFFFF" w:color="auto" w:val="clear"/>
             <w:tcMar>
@@ -3179,10 +3177,10 @@
           <w:tcPr>
             <w:tcW w:type="dxa" w:w="3900"/>
             <w:tcBorders>
-              <w:top w:val="single" w:color="F5D6A8" w:sz="6"/>
-              <w:left w:val="single" w:color="F5D6A8" w:sz="6"/>
-              <w:bottom w:val="single" w:color="F5D6A8" w:sz="6"/>
-              <w:right w:val="single" w:color="F5D6A8" w:sz="6"/>
+              <w:top w:val="single" w:color="E8D9B8" w:sz="6"/>
+              <w:left w:val="single" w:color="E8D9B8" w:sz="6"/>
+              <w:bottom w:val="single" w:color="E8D9B8" w:sz="6"/>
+              <w:right w:val="single" w:color="E8D9B8" w:sz="6"/>
             </w:tcBorders>
             <w:shd w:fill="FFFFFF" w:color="auto" w:val="clear"/>
             <w:tcMar>
@@ -3215,12 +3213,12 @@
           <w:tcPr>
             <w:tcW w:type="dxa" w:w="1898"/>
             <w:tcBorders>
-              <w:top w:val="single" w:color="F5D6A8" w:sz="6"/>
-              <w:left w:val="single" w:color="F5D6A8" w:sz="6"/>
-              <w:bottom w:val="single" w:color="F5D6A8" w:sz="6"/>
-              <w:right w:val="single" w:color="F5D6A8" w:sz="6"/>
+              <w:top w:val="single" w:color="E8D9B8" w:sz="6"/>
+              <w:left w:val="single" w:color="E8D9B8" w:sz="6"/>
+              <w:bottom w:val="single" w:color="E8D9B8" w:sz="6"/>
+              <w:right w:val="single" w:color="E8D9B8" w:sz="6"/>
             </w:tcBorders>
-            <w:shd w:fill="FFEFD2" w:color="auto" w:val="clear"/>
+            <w:shd w:fill="FFF4D6" w:color="auto" w:val="clear"/>
             <w:tcMar>
               <w:top w:type="dxa" w:w="90"/>
               <w:left w:type="dxa" w:w="120"/>
@@ -3239,7 +3237,7 @@
                 <w:rFonts w:ascii="微软雅黑" w:cs="微软雅黑" w:eastAsia="微软雅黑" w:hAnsi="微软雅黑"/>
                 <w:b/>
                 <w:bCs/>
-                <w:color w:val="D9700F"/>
+                <w:color w:val="C8423B"/>
                 <w:sz w:val="22"/>
                 <w:szCs w:val="22"/>
               </w:rPr>
@@ -3256,12 +3254,12 @@
           <w:tcPr>
             <w:tcW w:type="dxa" w:w="3500"/>
             <w:tcBorders>
-              <w:top w:val="single" w:color="F5D6A8" w:sz="6"/>
-              <w:left w:val="single" w:color="F5D6A8" w:sz="6"/>
-              <w:bottom w:val="single" w:color="F5D6A8" w:sz="6"/>
-              <w:right w:val="single" w:color="F5D6A8" w:sz="6"/>
+              <w:top w:val="single" w:color="E8D9B8" w:sz="6"/>
+              <w:left w:val="single" w:color="E8D9B8" w:sz="6"/>
+              <w:bottom w:val="single" w:color="E8D9B8" w:sz="6"/>
+              <w:right w:val="single" w:color="E8D9B8" w:sz="6"/>
             </w:tcBorders>
-            <w:shd w:fill="FFF9EF" w:color="auto" w:val="clear"/>
+            <w:shd w:fill="FBF8F0" w:color="auto" w:val="clear"/>
             <w:tcMar>
               <w:top w:type="dxa" w:w="90"/>
               <w:left w:type="dxa" w:w="120"/>
@@ -3292,12 +3290,12 @@
           <w:tcPr>
             <w:tcW w:type="dxa" w:w="3900"/>
             <w:tcBorders>
-              <w:top w:val="single" w:color="F5D6A8" w:sz="6"/>
-              <w:left w:val="single" w:color="F5D6A8" w:sz="6"/>
-              <w:bottom w:val="single" w:color="F5D6A8" w:sz="6"/>
-              <w:right w:val="single" w:color="F5D6A8" w:sz="6"/>
+              <w:top w:val="single" w:color="E8D9B8" w:sz="6"/>
+              <w:left w:val="single" w:color="E8D9B8" w:sz="6"/>
+              <w:bottom w:val="single" w:color="E8D9B8" w:sz="6"/>
+              <w:right w:val="single" w:color="E8D9B8" w:sz="6"/>
             </w:tcBorders>
-            <w:shd w:fill="FFF9EF" w:color="auto" w:val="clear"/>
+            <w:shd w:fill="FBF8F0" w:color="auto" w:val="clear"/>
             <w:tcMar>
               <w:top w:type="dxa" w:w="90"/>
               <w:left w:type="dxa" w:w="120"/>
@@ -3328,12 +3326,12 @@
           <w:tcPr>
             <w:tcW w:type="dxa" w:w="1898"/>
             <w:tcBorders>
-              <w:top w:val="single" w:color="F5D6A8" w:sz="6"/>
-              <w:left w:val="single" w:color="F5D6A8" w:sz="6"/>
-              <w:bottom w:val="single" w:color="F5D6A8" w:sz="6"/>
-              <w:right w:val="single" w:color="F5D6A8" w:sz="6"/>
+              <w:top w:val="single" w:color="E8D9B8" w:sz="6"/>
+              <w:left w:val="single" w:color="E8D9B8" w:sz="6"/>
+              <w:bottom w:val="single" w:color="E8D9B8" w:sz="6"/>
+              <w:right w:val="single" w:color="E8D9B8" w:sz="6"/>
             </w:tcBorders>
-            <w:shd w:fill="FFEFD2" w:color="auto" w:val="clear"/>
+            <w:shd w:fill="FFF4D6" w:color="auto" w:val="clear"/>
             <w:tcMar>
               <w:top w:type="dxa" w:w="90"/>
               <w:left w:type="dxa" w:w="120"/>
@@ -3352,7 +3350,7 @@
                 <w:rFonts w:ascii="微软雅黑" w:cs="微软雅黑" w:eastAsia="微软雅黑" w:hAnsi="微软雅黑"/>
                 <w:b/>
                 <w:bCs/>
-                <w:color w:val="D9700F"/>
+                <w:color w:val="C8423B"/>
                 <w:sz w:val="22"/>
                 <w:szCs w:val="22"/>
               </w:rPr>
@@ -3369,10 +3367,10 @@
           <w:tcPr>
             <w:tcW w:type="dxa" w:w="3500"/>
             <w:tcBorders>
-              <w:top w:val="single" w:color="F5D6A8" w:sz="6"/>
-              <w:left w:val="single" w:color="F5D6A8" w:sz="6"/>
-              <w:bottom w:val="single" w:color="F5D6A8" w:sz="6"/>
-              <w:right w:val="single" w:color="F5D6A8" w:sz="6"/>
+              <w:top w:val="single" w:color="E8D9B8" w:sz="6"/>
+              <w:left w:val="single" w:color="E8D9B8" w:sz="6"/>
+              <w:bottom w:val="single" w:color="E8D9B8" w:sz="6"/>
+              <w:right w:val="single" w:color="E8D9B8" w:sz="6"/>
             </w:tcBorders>
             <w:shd w:fill="FFFFFF" w:color="auto" w:val="clear"/>
             <w:tcMar>
@@ -3405,10 +3403,10 @@
           <w:tcPr>
             <w:tcW w:type="dxa" w:w="3900"/>
             <w:tcBorders>
-              <w:top w:val="single" w:color="F5D6A8" w:sz="6"/>
-              <w:left w:val="single" w:color="F5D6A8" w:sz="6"/>
-              <w:bottom w:val="single" w:color="F5D6A8" w:sz="6"/>
-              <w:right w:val="single" w:color="F5D6A8" w:sz="6"/>
+              <w:top w:val="single" w:color="E8D9B8" w:sz="6"/>
+              <w:left w:val="single" w:color="E8D9B8" w:sz="6"/>
+              <w:bottom w:val="single" w:color="E8D9B8" w:sz="6"/>
+              <w:right w:val="single" w:color="E8D9B8" w:sz="6"/>
             </w:tcBorders>
             <w:shd w:fill="FFFFFF" w:color="auto" w:val="clear"/>
             <w:tcMar>
@@ -3441,12 +3439,12 @@
           <w:tcPr>
             <w:tcW w:type="dxa" w:w="1898"/>
             <w:tcBorders>
-              <w:top w:val="single" w:color="F5D6A8" w:sz="6"/>
-              <w:left w:val="single" w:color="F5D6A8" w:sz="6"/>
-              <w:bottom w:val="single" w:color="F5D6A8" w:sz="6"/>
-              <w:right w:val="single" w:color="F5D6A8" w:sz="6"/>
+              <w:top w:val="single" w:color="E8D9B8" w:sz="6"/>
+              <w:left w:val="single" w:color="E8D9B8" w:sz="6"/>
+              <w:bottom w:val="single" w:color="E8D9B8" w:sz="6"/>
+              <w:right w:val="single" w:color="E8D9B8" w:sz="6"/>
             </w:tcBorders>
-            <w:shd w:fill="FFEFD2" w:color="auto" w:val="clear"/>
+            <w:shd w:fill="FFF4D6" w:color="auto" w:val="clear"/>
             <w:tcMar>
               <w:top w:type="dxa" w:w="90"/>
               <w:left w:type="dxa" w:w="120"/>
@@ -3465,7 +3463,7 @@
                 <w:rFonts w:ascii="微软雅黑" w:cs="微软雅黑" w:eastAsia="微软雅黑" w:hAnsi="微软雅黑"/>
                 <w:b/>
                 <w:bCs/>
-                <w:color w:val="D9700F"/>
+                <w:color w:val="C8423B"/>
                 <w:sz w:val="22"/>
                 <w:szCs w:val="22"/>
               </w:rPr>
@@ -3482,12 +3480,12 @@
           <w:tcPr>
             <w:tcW w:type="dxa" w:w="3500"/>
             <w:tcBorders>
-              <w:top w:val="single" w:color="F5D6A8" w:sz="6"/>
-              <w:left w:val="single" w:color="F5D6A8" w:sz="6"/>
-              <w:bottom w:val="single" w:color="F5D6A8" w:sz="6"/>
-              <w:right w:val="single" w:color="F5D6A8" w:sz="6"/>
+              <w:top w:val="single" w:color="E8D9B8" w:sz="6"/>
+              <w:left w:val="single" w:color="E8D9B8" w:sz="6"/>
+              <w:bottom w:val="single" w:color="E8D9B8" w:sz="6"/>
+              <w:right w:val="single" w:color="E8D9B8" w:sz="6"/>
             </w:tcBorders>
-            <w:shd w:fill="FFF9EF" w:color="auto" w:val="clear"/>
+            <w:shd w:fill="FBF8F0" w:color="auto" w:val="clear"/>
             <w:tcMar>
               <w:top w:type="dxa" w:w="90"/>
               <w:left w:type="dxa" w:w="120"/>
@@ -3518,12 +3516,12 @@
           <w:tcPr>
             <w:tcW w:type="dxa" w:w="3900"/>
             <w:tcBorders>
-              <w:top w:val="single" w:color="F5D6A8" w:sz="6"/>
-              <w:left w:val="single" w:color="F5D6A8" w:sz="6"/>
-              <w:bottom w:val="single" w:color="F5D6A8" w:sz="6"/>
-              <w:right w:val="single" w:color="F5D6A8" w:sz="6"/>
+              <w:top w:val="single" w:color="E8D9B8" w:sz="6"/>
+              <w:left w:val="single" w:color="E8D9B8" w:sz="6"/>
+              <w:bottom w:val="single" w:color="E8D9B8" w:sz="6"/>
+              <w:right w:val="single" w:color="E8D9B8" w:sz="6"/>
             </w:tcBorders>
-            <w:shd w:fill="FFF9EF" w:color="auto" w:val="clear"/>
+            <w:shd w:fill="FBF8F0" w:color="auto" w:val="clear"/>
             <w:tcMar>
               <w:top w:type="dxa" w:w="90"/>
               <w:left w:type="dxa" w:w="120"/>
@@ -3554,12 +3552,12 @@
           <w:tcPr>
             <w:tcW w:type="dxa" w:w="1898"/>
             <w:tcBorders>
-              <w:top w:val="single" w:color="F5D6A8" w:sz="6"/>
-              <w:left w:val="single" w:color="F5D6A8" w:sz="6"/>
-              <w:bottom w:val="single" w:color="F5D6A8" w:sz="6"/>
-              <w:right w:val="single" w:color="F5D6A8" w:sz="6"/>
+              <w:top w:val="single" w:color="E8D9B8" w:sz="6"/>
+              <w:left w:val="single" w:color="E8D9B8" w:sz="6"/>
+              <w:bottom w:val="single" w:color="E8D9B8" w:sz="6"/>
+              <w:right w:val="single" w:color="E8D9B8" w:sz="6"/>
             </w:tcBorders>
-            <w:shd w:fill="FFEFD2" w:color="auto" w:val="clear"/>
+            <w:shd w:fill="FFF4D6" w:color="auto" w:val="clear"/>
             <w:tcMar>
               <w:top w:type="dxa" w:w="90"/>
               <w:left w:type="dxa" w:w="120"/>
@@ -3578,7 +3576,7 @@
                 <w:rFonts w:ascii="微软雅黑" w:cs="微软雅黑" w:eastAsia="微软雅黑" w:hAnsi="微软雅黑"/>
                 <w:b/>
                 <w:bCs/>
-                <w:color w:val="D9700F"/>
+                <w:color w:val="C8423B"/>
                 <w:sz w:val="22"/>
                 <w:szCs w:val="22"/>
               </w:rPr>
@@ -3595,10 +3593,10 @@
           <w:tcPr>
             <w:tcW w:type="dxa" w:w="3500"/>
             <w:tcBorders>
-              <w:top w:val="single" w:color="F5D6A8" w:sz="6"/>
-              <w:left w:val="single" w:color="F5D6A8" w:sz="6"/>
-              <w:bottom w:val="single" w:color="F5D6A8" w:sz="6"/>
-              <w:right w:val="single" w:color="F5D6A8" w:sz="6"/>
+              <w:top w:val="single" w:color="E8D9B8" w:sz="6"/>
+              <w:left w:val="single" w:color="E8D9B8" w:sz="6"/>
+              <w:bottom w:val="single" w:color="E8D9B8" w:sz="6"/>
+              <w:right w:val="single" w:color="E8D9B8" w:sz="6"/>
             </w:tcBorders>
             <w:shd w:fill="FFFFFF" w:color="auto" w:val="clear"/>
             <w:tcMar>
@@ -3631,10 +3629,10 @@
           <w:tcPr>
             <w:tcW w:type="dxa" w:w="3900"/>
             <w:tcBorders>
-              <w:top w:val="single" w:color="F5D6A8" w:sz="6"/>
-              <w:left w:val="single" w:color="F5D6A8" w:sz="6"/>
-              <w:bottom w:val="single" w:color="F5D6A8" w:sz="6"/>
-              <w:right w:val="single" w:color="F5D6A8" w:sz="6"/>
+              <w:top w:val="single" w:color="E8D9B8" w:sz="6"/>
+              <w:left w:val="single" w:color="E8D9B8" w:sz="6"/>
+              <w:bottom w:val="single" w:color="E8D9B8" w:sz="6"/>
+              <w:right w:val="single" w:color="E8D9B8" w:sz="6"/>
             </w:tcBorders>
             <w:shd w:fill="FFFFFF" w:color="auto" w:val="clear"/>
             <w:tcMar>
@@ -3667,12 +3665,12 @@
           <w:tcPr>
             <w:tcW w:type="dxa" w:w="1898"/>
             <w:tcBorders>
-              <w:top w:val="single" w:color="F5D6A8" w:sz="6"/>
-              <w:left w:val="single" w:color="F5D6A8" w:sz="6"/>
-              <w:bottom w:val="single" w:color="F5D6A8" w:sz="6"/>
-              <w:right w:val="single" w:color="F5D6A8" w:sz="6"/>
+              <w:top w:val="single" w:color="E8D9B8" w:sz="6"/>
+              <w:left w:val="single" w:color="E8D9B8" w:sz="6"/>
+              <w:bottom w:val="single" w:color="E8D9B8" w:sz="6"/>
+              <w:right w:val="single" w:color="E8D9B8" w:sz="6"/>
             </w:tcBorders>
-            <w:shd w:fill="FFEFD2" w:color="auto" w:val="clear"/>
+            <w:shd w:fill="FFF4D6" w:color="auto" w:val="clear"/>
             <w:tcMar>
               <w:top w:type="dxa" w:w="90"/>
               <w:left w:type="dxa" w:w="120"/>
@@ -3691,7 +3689,7 @@
                 <w:rFonts w:ascii="微软雅黑" w:cs="微软雅黑" w:eastAsia="微软雅黑" w:hAnsi="微软雅黑"/>
                 <w:b/>
                 <w:bCs/>
-                <w:color w:val="D9700F"/>
+                <w:color w:val="C8423B"/>
                 <w:sz w:val="22"/>
                 <w:szCs w:val="22"/>
               </w:rPr>
@@ -3719,7 +3717,7 @@
           <w:rFonts w:ascii="Times New Roman" w:cs="Times New Roman" w:eastAsia="宋体" w:hAnsi="Times New Roman"/>
           <w:b/>
           <w:bCs/>
-          <w:color w:val="0B4B9B"/>
+          <w:color w:val="1E3460"/>
           <w:sz w:val="24"/>
           <w:szCs w:val="24"/>
         </w:rPr>
@@ -3750,7 +3748,7 @@
           <w:rFonts w:ascii="Times New Roman" w:cs="Times New Roman" w:eastAsia="宋体" w:hAnsi="Times New Roman"/>
           <w:b/>
           <w:bCs/>
-          <w:color w:val="0B4B9B"/>
+          <w:color w:val="1E3460"/>
           <w:sz w:val="24"/>
           <w:szCs w:val="24"/>
         </w:rPr>
@@ -3772,14 +3770,14 @@
       <w:pPr>
         <w:keepNext/>
         <w:pBdr>
-          <w:bottom w:val="dotted" w:color="FFCC39" w:sz="12" w:space="3"/>
+          <w:bottom w:val="single" w:color="C9D3E3" w:sz="6" w:space="3"/>
         </w:pBdr>
         <w:spacing w:after="100" w:before="220" w:line="300" w:lineRule="auto"/>
       </w:pPr>
       <w:r>
         <w:drawing>
           <wp:inline distT="0" distB="0" distL="0" distR="0">
-            <wp:extent cx="209550" cy="209550"/>
+            <wp:extent cx="190500" cy="190500"/>
             <wp:effectExtent t="0" r="0" b="0" l="0"/>
             <wp:docPr id="124" name="活动" descr="活动" title="活动"/>
             <wp:cNvGraphicFramePr>
@@ -3804,7 +3802,7 @@
                   <pic:spPr bwMode="auto">
                     <a:xfrm>
                       <a:off x="0" y="0"/>
-                      <a:ext cx="209550" cy="209550"/>
+                      <a:ext cx="190500" cy="190500"/>
                     </a:xfrm>
                     <a:prstGeom prst="rect">
                       <a:avLst/>
@@ -3821,7 +3819,7 @@
           <w:rFonts w:ascii="微软雅黑" w:cs="微软雅黑" w:eastAsia="微软雅黑" w:hAnsi="微软雅黑"/>
           <w:b/>
           <w:bCs/>
-          <w:color w:val="EE6A5F"/>
+          <w:color w:val="E89B0C"/>
           <w:sz w:val="26"/>
           <w:szCs w:val="26"/>
         </w:rPr>
@@ -3832,7 +3830,7 @@
           <w:rFonts w:ascii="微软雅黑" w:cs="微软雅黑" w:eastAsia="微软雅黑" w:hAnsi="微软雅黑"/>
           <w:b/>
           <w:bCs/>
-          <w:color w:val="12346E"/>
+          <w:color w:val="1E3460"/>
           <w:sz w:val="26"/>
           <w:szCs w:val="26"/>
         </w:rPr>
@@ -3872,7 +3870,7 @@
           <w:rFonts w:ascii="Times New Roman" w:cs="Times New Roman" w:eastAsia="宋体" w:hAnsi="Times New Roman"/>
           <w:b/>
           <w:bCs/>
-          <w:color w:val="0B4B9B"/>
+          <w:color w:val="1E3460"/>
           <w:sz w:val="24"/>
           <w:szCs w:val="24"/>
         </w:rPr>
@@ -3903,7 +3901,7 @@
           <w:rFonts w:ascii="Times New Roman" w:cs="Times New Roman" w:eastAsia="宋体" w:hAnsi="Times New Roman"/>
           <w:b/>
           <w:bCs/>
-          <w:color w:val="0B4B9B"/>
+          <w:color w:val="1E3460"/>
           <w:sz w:val="24"/>
           <w:szCs w:val="24"/>
         </w:rPr>
@@ -3934,7 +3932,7 @@
           <w:rFonts w:ascii="微软雅黑" w:cs="微软雅黑" w:eastAsia="微软雅黑" w:hAnsi="微软雅黑"/>
           <w:b/>
           <w:bCs/>
-          <w:color w:val="0B4B9B"/>
+          <w:color w:val="1E3460"/>
           <w:sz w:val="24"/>
           <w:szCs w:val="24"/>
         </w:rPr>
@@ -3955,14 +3953,14 @@
     <w:p>
       <w:pPr>
         <w:pBdr>
-          <w:top w:val="dashed" w:color="F5B041" w:sz="8" w:space="6"/>
-          <w:left w:val="dashed" w:color="F5B041" w:sz="8" w:space="6"/>
-          <w:bottom w:val="dashed" w:color="F5B041" w:sz="8" w:space="6"/>
-          <w:right w:val="dashed" w:color="F5B041" w:sz="8" w:space="6"/>
+          <w:top w:val="single" w:color="FFF6D5" w:sz="4" w:space="5"/>
+          <w:left w:val="single" w:color="F2B705" w:sz="36" w:space="10"/>
+          <w:bottom w:val="single" w:color="FFF6D5" w:sz="4" w:space="5"/>
+          <w:right w:val="single" w:color="FFF6D5" w:sz="4" w:space="5"/>
         </w:pBdr>
-        <w:shd w:fill="FFF7E1" w:color="auto" w:val="clear"/>
+        <w:shd w:fill="FFF6D5" w:color="auto" w:val="clear"/>
         <w:spacing w:after="160" w:before="200" w:line="440" w:lineRule="exact"/>
-        <w:ind w:left="140" w:right="140"/>
+        <w:ind w:left="200" w:right="120"/>
         <w:jc w:val="both"/>
       </w:pPr>
       <w:r>
@@ -3970,7 +3968,7 @@
           <w:rFonts w:ascii="Times New Roman" w:cs="Times New Roman" w:eastAsia="楷体" w:hAnsi="Times New Roman"/>
           <w:b/>
           <w:bCs/>
-          <w:color w:val="D9700F"/>
+          <w:color w:val="C8423B"/>
           <w:sz w:val="24"/>
           <w:szCs w:val="24"/>
         </w:rPr>
@@ -3981,7 +3979,7 @@
           <w:rFonts w:ascii="Times New Roman" w:cs="Times New Roman" w:eastAsia="楷体" w:hAnsi="Times New Roman"/>
           <w:b w:val="false"/>
           <w:bCs w:val="false"/>
-          <w:color w:val="4A3B2A"/>
+          <w:color w:val="3D3D3D"/>
           <w:sz w:val="24"/>
           <w:szCs w:val="24"/>
         </w:rPr>
@@ -4081,15 +4079,15 @@
           <w:tcPr>
             <w:tcW w:type="dxa" w:w="7298"/>
             <w:tcBorders>
-              <w:top w:val="dashed" w:color="0B4B9B" w:sz="12" w:space="0"/>
-              <w:left w:val="dashed" w:color="0B4B9B" w:sz="12" w:space="0"/>
-              <w:bottom w:val="dashed" w:color="0B4B9B" w:sz="12" w:space="0"/>
-              <w:right w:val="dashed" w:color="0B4B9B" w:sz="12" w:space="0"/>
+              <w:top w:val="single" w:color="1E3460" w:sz="24" w:space="0"/>
+              <w:left w:val="double" w:color="E07A73" w:sz="6" w:space="0"/>
+              <w:bottom w:val="single" w:color="D5DCE6" w:sz="6" w:space="0"/>
+              <w:right w:val="single" w:color="D5DCE6" w:sz="6" w:space="0"/>
             </w:tcBorders>
-            <w:shd w:fill="EAF3FF" w:color="auto" w:val="clear"/>
+            <w:shd w:fill="FFFDF6" w:color="auto" w:val="clear"/>
             <w:tcMar>
               <w:top w:type="dxa" w:w="220"/>
-              <w:left w:type="dxa" w:w="260"/>
+              <w:left w:type="dxa" w:w="320"/>
               <w:bottom w:type="dxa" w:w="220"/>
               <w:right w:type="dxa" w:w="260"/>
             </w:tcMar>
@@ -4104,7 +4102,7 @@
                 <w:rFonts w:ascii="微软雅黑" w:cs="微软雅黑" w:eastAsia="微软雅黑" w:hAnsi="微软雅黑"/>
                 <w:b/>
                 <w:bCs/>
-                <w:color w:val="0B4B9B"/>
+                <w:color w:val="1E3460"/>
                 <w:sz w:val="26"/>
                 <w:szCs w:val="26"/>
               </w:rPr>
@@ -4124,7 +4122,7 @@
                 <w:rFonts w:ascii="Times New Roman" w:cs="Times New Roman" w:eastAsia="宋体" w:hAnsi="Times New Roman"/>
                 <w:b w:val="false"/>
                 <w:bCs w:val="false"/>
-                <w:color w:val="12346E"/>
+                <w:color w:val="2B2B2B"/>
                 <w:sz w:val="24"/>
                 <w:szCs w:val="24"/>
               </w:rPr>
@@ -4137,13 +4135,13 @@
     <w:p>
       <w:pPr>
         <w:keepNext/>
-        <w:spacing w:after="100" w:before="220" w:line="240" w:lineRule="auto"/>
+        <w:spacing w:after="120" w:before="240" w:line="240" w:lineRule="auto"/>
         <w:jc w:val="left"/>
       </w:pPr>
       <w:r>
         <w:drawing>
           <wp:inline distT="0" distB="0" distL="0" distR="0">
-            <wp:extent cx="2238375" cy="361950"/>
+            <wp:extent cx="5905500" cy="342900"/>
             <wp:effectExtent t="0" r="0" b="0" l="0"/>
             <wp:docPr id="126" name="【班会后延伸教育活动】" descr="【班会后延伸教育活动】" title="【班会后延伸教育活动】"/>
             <wp:cNvGraphicFramePr>
@@ -4168,7 +4166,7 @@
                   <pic:spPr bwMode="auto">
                     <a:xfrm>
                       <a:off x="0" y="0"/>
-                      <a:ext cx="2238375" cy="361950"/>
+                      <a:ext cx="5905500" cy="342900"/>
                     </a:xfrm>
                     <a:prstGeom prst="rect">
                       <a:avLst/>
@@ -4185,18 +4183,19 @@
       <w:tblPr>
         <w:tblW w:type="dxa" w:w="9298"/>
         <w:tblBorders>
-          <w:top w:val="single" w:color="auto" w:sz="4"/>
-          <w:left w:val="single" w:color="auto" w:sz="4"/>
-          <w:bottom w:val="single" w:color="auto" w:sz="4"/>
-          <w:right w:val="single" w:color="auto" w:sz="4"/>
-          <w:insideH w:val="single" w:color="auto" w:sz="4"/>
-          <w:insideV w:val="single" w:color="auto" w:sz="4"/>
+          <w:top w:val="none" w:color="FFFFFF" w:sz="0"/>
+          <w:left w:val="none" w:color="FFFFFF" w:sz="0"/>
+          <w:bottom w:val="none" w:color="FFFFFF" w:sz="0"/>
+          <w:right w:val="none" w:color="FFFFFF" w:sz="0"/>
+          <w:insideH w:val="none" w:color="FFFFFF" w:sz="0"/>
+          <w:insideV w:val="none" w:color="FFFFFF" w:sz="0"/>
         </w:tblBorders>
         <w:tblLayout w:type="fixed"/>
       </w:tblPr>
       <w:tblGrid>
-        <w:gridCol w:w="4649"/>
-        <w:gridCol w:w="4649"/>
+        <w:gridCol w:w="4539"/>
+        <w:gridCol w:w="220"/>
+        <w:gridCol w:w="4539"/>
       </w:tblGrid>
       <w:tr>
         <w:trPr>
@@ -4204,14 +4203,14 @@
         </w:trPr>
         <w:tc>
           <w:tcPr>
-            <w:tcW w:type="dxa" w:w="4649"/>
+            <w:tcW w:type="dxa" w:w="4539"/>
             <w:tcBorders>
-              <w:top w:val="single" w:color="FFFEFA" w:sz="48"/>
-              <w:left w:val="single" w:color="FFFEFA" w:sz="48"/>
-              <w:bottom w:val="single" w:color="FFFEFA" w:sz="48"/>
-              <w:right w:val="single" w:color="FFFEFA" w:sz="48"/>
+              <w:top w:val="single" w:color="2F6FD0" w:sz="36"/>
+              <w:left w:val="single" w:color="D5DCE6" w:sz="6"/>
+              <w:bottom w:val="single" w:color="D5DCE6" w:sz="6"/>
+              <w:right w:val="single" w:color="D5DCE6" w:sz="6"/>
             </w:tcBorders>
-            <w:shd w:fill="E3EEFB" w:color="auto" w:val="clear"/>
+            <w:shd w:fill="FFFFFF" w:color="auto" w:val="clear"/>
             <w:tcMar>
               <w:top w:type="dxa" w:w="200"/>
               <w:left w:type="dxa" w:w="240"/>
@@ -4276,7 +4275,7 @@
                 <w:rFonts w:ascii="微软雅黑" w:cs="微软雅黑" w:eastAsia="微软雅黑" w:hAnsi="微软雅黑"/>
                 <w:b/>
                 <w:bCs/>
-                <w:color w:val="0B4B9B"/>
+                <w:color w:val="2458A8"/>
                 <w:sz w:val="23"/>
                 <w:szCs w:val="23"/>
               </w:rPr>
@@ -4303,14 +4302,33 @@
         </w:tc>
         <w:tc>
           <w:tcPr>
-            <w:tcW w:type="dxa" w:w="4649"/>
+            <w:tcW w:type="dxa" w:w="220"/>
             <w:tcBorders>
-              <w:top w:val="single" w:color="FFFEFA" w:sz="48"/>
-              <w:left w:val="single" w:color="FFFEFA" w:sz="48"/>
-              <w:bottom w:val="single" w:color="FFFEFA" w:sz="48"/>
-              <w:right w:val="single" w:color="FFFEFA" w:sz="48"/>
+              <w:top w:val="none" w:color="FFFFFF" w:sz="0"/>
+              <w:left w:val="none" w:color="FFFFFF" w:sz="0"/>
+              <w:bottom w:val="none" w:color="FFFFFF" w:sz="0"/>
+              <w:right w:val="none" w:color="FFFFFF" w:sz="0"/>
             </w:tcBorders>
-            <w:shd w:fill="FFF1D6" w:color="auto" w:val="clear"/>
+            <w:tcMar>
+              <w:top w:type="dxa" w:w="0"/>
+              <w:left w:type="dxa" w:w="0"/>
+              <w:bottom w:type="dxa" w:w="0"/>
+              <w:right w:type="dxa" w:w="0"/>
+            </w:tcMar>
+            <w:vAlign w:val="center"/>
+          </w:tcPr>
+          <w:p/>
+        </w:tc>
+        <w:tc>
+          <w:tcPr>
+            <w:tcW w:type="dxa" w:w="4539"/>
+            <w:tcBorders>
+              <w:top w:val="single" w:color="D9534F" w:sz="36"/>
+              <w:left w:val="single" w:color="D5DCE6" w:sz="6"/>
+              <w:bottom w:val="single" w:color="D5DCE6" w:sz="6"/>
+              <w:right w:val="single" w:color="D5DCE6" w:sz="6"/>
+            </w:tcBorders>
+            <w:shd w:fill="FFFFFF" w:color="auto" w:val="clear"/>
             <w:tcMar>
               <w:top w:type="dxa" w:w="200"/>
               <w:left w:type="dxa" w:w="240"/>
@@ -4375,7 +4393,7 @@
                 <w:rFonts w:ascii="微软雅黑" w:cs="微软雅黑" w:eastAsia="微软雅黑" w:hAnsi="微软雅黑"/>
                 <w:b/>
                 <w:bCs/>
-                <w:color w:val="D9700F"/>
+                <w:color w:val="B8423C"/>
                 <w:sz w:val="23"/>
                 <w:szCs w:val="23"/>
               </w:rPr>
@@ -4403,18 +4421,80 @@
       </w:tr>
       <w:tr>
         <w:trPr>
+          <w:trHeight w:val="200" w:hRule="exact"/>
+        </w:trPr>
+        <w:tc>
+          <w:tcPr>
+            <w:tcW w:type="dxa" w:w="4539"/>
+            <w:tcBorders>
+              <w:top w:val="none" w:color="FFFFFF" w:sz="0"/>
+              <w:left w:val="none" w:color="FFFFFF" w:sz="0"/>
+              <w:bottom w:val="none" w:color="FFFFFF" w:sz="0"/>
+              <w:right w:val="none" w:color="FFFFFF" w:sz="0"/>
+            </w:tcBorders>
+            <w:tcMar>
+              <w:top w:type="dxa" w:w="0"/>
+              <w:left w:type="dxa" w:w="0"/>
+              <w:bottom w:type="dxa" w:w="0"/>
+              <w:right w:type="dxa" w:w="0"/>
+            </w:tcMar>
+            <w:vAlign w:val="center"/>
+          </w:tcPr>
+          <w:p/>
+        </w:tc>
+        <w:tc>
+          <w:tcPr>
+            <w:tcW w:type="dxa" w:w="220"/>
+            <w:tcBorders>
+              <w:top w:val="none" w:color="FFFFFF" w:sz="0"/>
+              <w:left w:val="none" w:color="FFFFFF" w:sz="0"/>
+              <w:bottom w:val="none" w:color="FFFFFF" w:sz="0"/>
+              <w:right w:val="none" w:color="FFFFFF" w:sz="0"/>
+            </w:tcBorders>
+            <w:tcMar>
+              <w:top w:type="dxa" w:w="0"/>
+              <w:left w:type="dxa" w:w="0"/>
+              <w:bottom w:type="dxa" w:w="0"/>
+              <w:right w:type="dxa" w:w="0"/>
+            </w:tcMar>
+            <w:vAlign w:val="center"/>
+          </w:tcPr>
+          <w:p/>
+        </w:tc>
+        <w:tc>
+          <w:tcPr>
+            <w:tcW w:type="dxa" w:w="4539"/>
+            <w:tcBorders>
+              <w:top w:val="none" w:color="FFFFFF" w:sz="0"/>
+              <w:left w:val="none" w:color="FFFFFF" w:sz="0"/>
+              <w:bottom w:val="none" w:color="FFFFFF" w:sz="0"/>
+              <w:right w:val="none" w:color="FFFFFF" w:sz="0"/>
+            </w:tcBorders>
+            <w:tcMar>
+              <w:top w:type="dxa" w:w="0"/>
+              <w:left w:type="dxa" w:w="0"/>
+              <w:bottom w:type="dxa" w:w="0"/>
+              <w:right w:type="dxa" w:w="0"/>
+            </w:tcMar>
+            <w:vAlign w:val="center"/>
+          </w:tcPr>
+          <w:p/>
+        </w:tc>
+      </w:tr>
+      <w:tr>
+        <w:trPr>
           <w:cantSplit/>
         </w:trPr>
         <w:tc>
           <w:tcPr>
-            <w:tcW w:type="dxa" w:w="4649"/>
+            <w:tcW w:type="dxa" w:w="4539"/>
             <w:tcBorders>
-              <w:top w:val="single" w:color="FFFEFA" w:sz="48"/>
-              <w:left w:val="single" w:color="FFFEFA" w:sz="48"/>
-              <w:bottom w:val="single" w:color="FFFEFA" w:sz="48"/>
-              <w:right w:val="single" w:color="FFFEFA" w:sz="48"/>
+              <w:top w:val="single" w:color="2A9D8F" w:sz="36"/>
+              <w:left w:val="single" w:color="D5DCE6" w:sz="6"/>
+              <w:bottom w:val="single" w:color="D5DCE6" w:sz="6"/>
+              <w:right w:val="single" w:color="D5DCE6" w:sz="6"/>
             </w:tcBorders>
-            <w:shd w:fill="E1F5EA" w:color="auto" w:val="clear"/>
+            <w:shd w:fill="FFFFFF" w:color="auto" w:val="clear"/>
             <w:tcMar>
               <w:top w:type="dxa" w:w="200"/>
               <w:left w:type="dxa" w:w="240"/>
@@ -4479,7 +4559,7 @@
                 <w:rFonts w:ascii="微软雅黑" w:cs="微软雅黑" w:eastAsia="微软雅黑" w:hAnsi="微软雅黑"/>
                 <w:b/>
                 <w:bCs/>
-                <w:color w:val="1E8A5A"/>
+                <w:color w:val="1F7F73"/>
                 <w:sz w:val="23"/>
                 <w:szCs w:val="23"/>
               </w:rPr>
@@ -4506,14 +4586,33 @@
         </w:tc>
         <w:tc>
           <w:tcPr>
-            <w:tcW w:type="dxa" w:w="4649"/>
+            <w:tcW w:type="dxa" w:w="220"/>
             <w:tcBorders>
-              <w:top w:val="single" w:color="FFFEFA" w:sz="48"/>
-              <w:left w:val="single" w:color="FFFEFA" w:sz="48"/>
-              <w:bottom w:val="single" w:color="FFFEFA" w:sz="48"/>
-              <w:right w:val="single" w:color="FFFEFA" w:sz="48"/>
+              <w:top w:val="none" w:color="FFFFFF" w:sz="0"/>
+              <w:left w:val="none" w:color="FFFFFF" w:sz="0"/>
+              <w:bottom w:val="none" w:color="FFFFFF" w:sz="0"/>
+              <w:right w:val="none" w:color="FFFFFF" w:sz="0"/>
             </w:tcBorders>
-            <w:shd w:fill="FDE6E4" w:color="auto" w:val="clear"/>
+            <w:tcMar>
+              <w:top w:type="dxa" w:w="0"/>
+              <w:left w:type="dxa" w:w="0"/>
+              <w:bottom w:type="dxa" w:w="0"/>
+              <w:right w:type="dxa" w:w="0"/>
+            </w:tcMar>
+            <w:vAlign w:val="center"/>
+          </w:tcPr>
+          <w:p/>
+        </w:tc>
+        <w:tc>
+          <w:tcPr>
+            <w:tcW w:type="dxa" w:w="4539"/>
+            <w:tcBorders>
+              <w:top w:val="single" w:color="E89B0C" w:sz="36"/>
+              <w:left w:val="single" w:color="D5DCE6" w:sz="6"/>
+              <w:bottom w:val="single" w:color="D5DCE6" w:sz="6"/>
+              <w:right w:val="single" w:color="D5DCE6" w:sz="6"/>
+            </w:tcBorders>
+            <w:shd w:fill="FFFFFF" w:color="auto" w:val="clear"/>
             <w:tcMar>
               <w:top w:type="dxa" w:w="200"/>
               <w:left w:type="dxa" w:w="240"/>
@@ -4578,7 +4677,7 @@
                 <w:rFonts w:ascii="微软雅黑" w:cs="微软雅黑" w:eastAsia="微软雅黑" w:hAnsi="微软雅黑"/>
                 <w:b/>
                 <w:bCs/>
-                <w:color w:val="C9463C"/>
+                <w:color w:val="A86C05"/>
                 <w:sz w:val="23"/>
                 <w:szCs w:val="23"/>
               </w:rPr>
@@ -4608,13 +4707,13 @@
     <w:p>
       <w:pPr>
         <w:keepNext/>
-        <w:spacing w:after="100" w:before="220" w:line="240" w:lineRule="auto"/>
+        <w:spacing w:after="120" w:before="240" w:line="240" w:lineRule="auto"/>
         <w:jc w:val="left"/>
       </w:pPr>
       <w:r>
         <w:drawing>
           <wp:inline distT="0" distB="0" distL="0" distR="0">
-            <wp:extent cx="1409700" cy="361950"/>
+            <wp:extent cx="5905500" cy="342900"/>
             <wp:effectExtent t="0" r="0" b="0" l="0"/>
             <wp:docPr id="131" name="【板书设计】" descr="【板书设计】" title="【板书设计】"/>
             <wp:cNvGraphicFramePr>
@@ -4639,7 +4738,7 @@
                   <pic:spPr bwMode="auto">
                     <a:xfrm>
                       <a:off x="0" y="0"/>
-                      <a:ext cx="1409700" cy="361950"/>
+                      <a:ext cx="5905500" cy="342900"/>
                     </a:xfrm>
                     <a:prstGeom prst="rect">
                       <a:avLst/>
@@ -4702,13 +4801,13 @@
     <w:p>
       <w:pPr>
         <w:keepNext/>
-        <w:spacing w:after="100" w:before="220" w:line="240" w:lineRule="auto"/>
+        <w:spacing w:after="120" w:before="240" w:line="240" w:lineRule="auto"/>
         <w:jc w:val="left"/>
       </w:pPr>
       <w:r>
         <w:drawing>
           <wp:inline distT="0" distB="0" distL="0" distR="0">
-            <wp:extent cx="1409700" cy="361950"/>
+            <wp:extent cx="5905500" cy="342900"/>
             <wp:effectExtent t="0" r="0" b="0" l="0"/>
             <wp:docPr id="133" name="【班会反思】" descr="【班会反思】" title="【班会反思】"/>
             <wp:cNvGraphicFramePr>
@@ -4733,7 +4832,7 @@
                   <pic:spPr bwMode="auto">
                     <a:xfrm>
                       <a:off x="0" y="0"/>
-                      <a:ext cx="1409700" cy="361950"/>
+                      <a:ext cx="5905500" cy="342900"/>
                     </a:xfrm>
                     <a:prstGeom prst="rect">
                       <a:avLst/>
@@ -4779,7 +4878,7 @@
           <w:rFonts w:ascii="Times New Roman" w:cs="Times New Roman" w:eastAsia="宋体" w:hAnsi="Times New Roman"/>
           <w:b/>
           <w:bCs/>
-          <w:color w:val="0B4B9B"/>
+          <w:color w:val="1E3460"/>
           <w:sz w:val="24"/>
           <w:szCs w:val="24"/>
         </w:rPr>
@@ -4810,7 +4909,7 @@
           <w:rFonts w:ascii="Times New Roman" w:cs="Times New Roman" w:eastAsia="宋体" w:hAnsi="Times New Roman"/>
           <w:b/>
           <w:bCs/>
-          <w:color w:val="0B4B9B"/>
+          <w:color w:val="1E3460"/>
           <w:sz w:val="24"/>
           <w:szCs w:val="24"/>
         </w:rPr>
@@ -4841,7 +4940,7 @@
           <w:rFonts w:ascii="Times New Roman" w:cs="Times New Roman" w:eastAsia="宋体" w:hAnsi="Times New Roman"/>
           <w:b/>
           <w:bCs/>
-          <w:color w:val="0B4B9B"/>
+          <w:color w:val="1E3460"/>
           <w:sz w:val="24"/>
           <w:szCs w:val="24"/>
         </w:rPr>
@@ -4872,7 +4971,7 @@
           <w:rFonts w:ascii="Times New Roman" w:cs="Times New Roman" w:eastAsia="宋体" w:hAnsi="Times New Roman"/>
           <w:b/>
           <w:bCs/>
-          <w:color w:val="0B4B9B"/>
+          <w:color w:val="1E3460"/>
           <w:sz w:val="24"/>
           <w:szCs w:val="24"/>
         </w:rPr>
@@ -4894,7 +4993,7 @@
       <w:headerReference w:type="default" r:id="rId7"/>
       <w:footerReference w:type="default" r:id="rId8"/>
       <w:pgSz w:w="11906" w:h="16838" w:orient="portrait"/>
-      <w:pgMar w:top="1420" w:right="1304" w:bottom="1300" w:left="1304" w:header="560" w:footer="780" w:gutter="0"/>
+      <w:pgMar w:top="1300" w:right="1190" w:bottom="1250" w:left="1418" w:header="500" w:footer="620" w:gutter="0"/>
       <w:pgNumType/>
       <w:docGrid w:linePitch="360"/>
     </w:sectPr>
@@ -4954,7 +5053,7 @@
         <w:rFonts w:ascii="微软雅黑" w:cs="微软雅黑" w:eastAsia="微软雅黑" w:hAnsi="微软雅黑"/>
         <w:b/>
         <w:bCs/>
-        <w:color w:val="0B4B9B"/>
+        <w:color w:val="1E3460"/>
         <w:sz w:val="18"/>
         <w:szCs w:val="18"/>
       </w:rPr>

</xml_diff>

<commit_message>
Add generated character poses to cover, survey and stage banners
Cut out poses A-E (white background, rembg) and place them: A on the
cover, B on the survey sheet, C/D/E standing at the right end of the
stage 1-3 case folders, the whistle pose on the intro folder. Floor clue
line and dominoes are added back after the cutout. Stage 4 folder, the
closing card and the ending image wait for the remaining poses.

Co-Authored-By: Claude Opus 5.5 <noreply@anthropic.com>
Claude-Session: https://claude.ai/code/session_0172ga6Pq1pjSb9Cqb6GGu5J
</commit_message>
<xml_diff>
--- a/banhui-meihua/队伍侦探社_班会设计_美化版.docx
+++ b/banhui-meihua/队伍侦探社_班会设计_美化版.docx
@@ -670,13 +670,13 @@
     <w:p>
       <w:pPr>
         <w:keepNext/>
-        <w:spacing w:after="120" w:before="260" w:line="240" w:lineRule="auto"/>
+        <w:spacing w:after="120" w:before="240" w:line="240" w:lineRule="auto"/>
         <w:jc w:val="center"/>
       </w:pPr>
       <w:r>
         <w:drawing>
           <wp:inline distT="0" distB="0" distL="0" distR="0">
-            <wp:extent cx="5200650" cy="781050"/>
+            <wp:extent cx="5200650" cy="1019175"/>
             <wp:effectExtent t="0" r="0" b="0" l="0"/>
             <wp:docPr id="108" name="导入：侦探集结令——初识队伍一条线" descr="导入：侦探集结令——初识队伍一条线" title="导入：侦探集结令——初识队伍一条线"/>
             <wp:cNvGraphicFramePr>
@@ -701,7 +701,7 @@
                   <pic:spPr bwMode="auto">
                     <a:xfrm>
                       <a:off x="0" y="0"/>
-                      <a:ext cx="5200650" cy="781050"/>
+                      <a:ext cx="5200650" cy="1019175"/>
                     </a:xfrm>
                     <a:prstGeom prst="rect">
                       <a:avLst/>
@@ -824,13 +824,13 @@
     <w:p>
       <w:pPr>
         <w:keepNext/>
-        <w:spacing w:after="120" w:before="260" w:line="240" w:lineRule="auto"/>
+        <w:spacing w:after="120" w:before="240" w:line="240" w:lineRule="auto"/>
         <w:jc w:val="center"/>
       </w:pPr>
       <w:r>
         <w:drawing>
           <wp:inline distT="0" distB="0" distL="0" distR="0">
-            <wp:extent cx="5200650" cy="781050"/>
+            <wp:extent cx="5200650" cy="1019175"/>
             <wp:effectExtent t="0" r="0" b="0" l="0"/>
             <wp:docPr id="109" name="环节一  循线索·辨队列之乱" descr="环节一  循线索·辨队列之乱" title="环节一  循线索·辨队列之乱"/>
             <wp:cNvGraphicFramePr>
@@ -855,7 +855,7 @@
                   <pic:spPr bwMode="auto">
                     <a:xfrm>
                       <a:off x="0" y="0"/>
-                      <a:ext cx="5200650" cy="781050"/>
+                      <a:ext cx="5200650" cy="1019175"/>
                     </a:xfrm>
                     <a:prstGeom prst="rect">
                       <a:avLst/>
@@ -1120,13 +1120,13 @@
     <w:p>
       <w:pPr>
         <w:keepNext/>
-        <w:spacing w:after="120" w:before="260" w:line="240" w:lineRule="auto"/>
+        <w:spacing w:after="120" w:before="240" w:line="240" w:lineRule="auto"/>
         <w:jc w:val="center"/>
       </w:pPr>
       <w:r>
         <w:drawing>
           <wp:inline distT="0" distB="0" distL="0" distR="0">
-            <wp:extent cx="5200650" cy="781050"/>
+            <wp:extent cx="5200650" cy="1019175"/>
             <wp:effectExtent t="0" r="0" b="0" l="0"/>
             <wp:docPr id="112" name="环节二  探现场·察隐患之危" descr="环节二  探现场·察隐患之危" title="环节二  探现场·察隐患之危"/>
             <wp:cNvGraphicFramePr>
@@ -1151,7 +1151,7 @@
                   <pic:spPr bwMode="auto">
                     <a:xfrm>
                       <a:off x="0" y="0"/>
-                      <a:ext cx="5200650" cy="781050"/>
+                      <a:ext cx="5200650" cy="1019175"/>
                     </a:xfrm>
                     <a:prstGeom prst="rect">
                       <a:avLst/>
@@ -2225,13 +2225,13 @@
     <w:p>
       <w:pPr>
         <w:keepNext/>
-        <w:spacing w:after="120" w:before="260" w:line="240" w:lineRule="auto"/>
+        <w:spacing w:after="120" w:before="240" w:line="240" w:lineRule="auto"/>
         <w:jc w:val="center"/>
       </w:pPr>
       <w:r>
         <w:drawing>
           <wp:inline distT="0" distB="0" distL="0" distR="0">
-            <wp:extent cx="5200650" cy="781050"/>
+            <wp:extent cx="5200650" cy="1019175"/>
             <wp:effectExtent t="0" r="0" b="0" l="0"/>
             <wp:docPr id="117" name="环节三  解密码·立守护之法" descr="环节三  解密码·立守护之法" title="环节三  解密码·立守护之法"/>
             <wp:cNvGraphicFramePr>
@@ -2256,7 +2256,7 @@
                   <pic:spPr bwMode="auto">
                     <a:xfrm>
                       <a:off x="0" y="0"/>
-                      <a:ext cx="5200650" cy="781050"/>
+                      <a:ext cx="5200650" cy="1019175"/>
                     </a:xfrm>
                     <a:prstGeom prst="rect">
                       <a:avLst/>
@@ -2626,7 +2626,7 @@
     <w:p>
       <w:pPr>
         <w:keepNext/>
-        <w:spacing w:after="120" w:before="260" w:line="240" w:lineRule="auto"/>
+        <w:spacing w:after="120" w:before="240" w:line="240" w:lineRule="auto"/>
         <w:jc w:val="center"/>
       </w:pPr>
       <w:r>

</xml_diff>